<commit_message>
Update documentation and clean up files
</commit_message>
<xml_diff>
--- a/documentation_v2.docx
+++ b/documentation_v2.docx
@@ -201,18 +201,15 @@
         </w:rPr>
         <w:t xml:space="preserve"> Αντρέας</w:t>
       </w:r>
-    </w:p>
-    <w:p>
-      <w:pPr>
-        <w:jc w:val="center"/>
+      <w:r>
         <w:rPr>
           <w:b/>
           <w:bCs/>
           <w:sz w:val="36"/>
           <w:szCs w:val="36"/>
         </w:rPr>
-      </w:pPr>
-      <w:proofErr w:type="spellStart"/>
+        <w:t xml:space="preserve"> </w:t>
+      </w:r>
       <w:r>
         <w:rPr>
           <w:b/>
@@ -220,9 +217,8 @@
           <w:sz w:val="36"/>
           <w:szCs w:val="36"/>
         </w:rPr>
-        <w:t>Μύαρης</w:t>
-      </w:r>
-      <w:proofErr w:type="spellEnd"/>
+        <w:t>Π</w:t>
+      </w:r>
       <w:r>
         <w:rPr>
           <w:b/>
@@ -230,7 +226,65 @@
           <w:sz w:val="36"/>
           <w:szCs w:val="36"/>
         </w:rPr>
+        <w:t>22246</w:t>
+      </w:r>
+    </w:p>
+    <w:p>
+      <w:pPr>
+        <w:jc w:val="center"/>
+        <w:rPr>
+          <w:b/>
+          <w:bCs/>
+          <w:sz w:val="36"/>
+          <w:szCs w:val="36"/>
+        </w:rPr>
+      </w:pPr>
+      <w:proofErr w:type="spellStart"/>
+      <w:r>
+        <w:rPr>
+          <w:b/>
+          <w:bCs/>
+          <w:sz w:val="36"/>
+          <w:szCs w:val="36"/>
+        </w:rPr>
+        <w:t>Μύαρης</w:t>
+      </w:r>
+      <w:proofErr w:type="spellEnd"/>
+      <w:r>
+        <w:rPr>
+          <w:b/>
+          <w:bCs/>
+          <w:sz w:val="36"/>
+          <w:szCs w:val="36"/>
+        </w:rPr>
         <w:t xml:space="preserve"> Στέλιος</w:t>
+      </w:r>
+      <w:r>
+        <w:rPr>
+          <w:b/>
+          <w:bCs/>
+          <w:sz w:val="36"/>
+          <w:szCs w:val="36"/>
+        </w:rPr>
+        <w:t xml:space="preserve"> </w:t>
+      </w:r>
+      <w:r>
+        <w:rPr>
+          <w:b/>
+          <w:bCs/>
+          <w:sz w:val="36"/>
+          <w:szCs w:val="36"/>
+        </w:rPr>
+        <w:t>Π</w:t>
+      </w:r>
+      <w:r>
+        <w:rPr>
+          <w:b/>
+          <w:bCs/>
+          <w:sz w:val="36"/>
+          <w:szCs w:val="36"/>
+        </w:rPr>
+        <w:t>22114</w:t>
       </w:r>
     </w:p>
     <w:p>
@@ -786,7 +840,6 @@
           <w:sz w:val="40"/>
           <w:szCs w:val="40"/>
           <w:u w:val="single"/>
-          <w:lang w:val="en-US"/>
         </w:rPr>
       </w:pPr>
       <w:r>
@@ -819,7 +872,38 @@
           <w:u w:val="single"/>
           <w:lang w:val="en-US"/>
         </w:rPr>
-        <w:t>level Overview:</w:t>
+        <w:t>level</w:t>
+      </w:r>
+      <w:r>
+        <w:rPr>
+          <w:b/>
+          <w:bCs/>
+          <w:sz w:val="40"/>
+          <w:szCs w:val="40"/>
+          <w:u w:val="single"/>
+        </w:rPr>
+        <w:t xml:space="preserve"> </w:t>
+      </w:r>
+      <w:r>
+        <w:rPr>
+          <w:b/>
+          <w:bCs/>
+          <w:sz w:val="40"/>
+          <w:szCs w:val="40"/>
+          <w:u w:val="single"/>
+          <w:lang w:val="en-US"/>
+        </w:rPr>
+        <w:t>Overview</w:t>
+      </w:r>
+      <w:r>
+        <w:rPr>
+          <w:b/>
+          <w:bCs/>
+          <w:sz w:val="40"/>
+          <w:szCs w:val="40"/>
+          <w:u w:val="single"/>
+        </w:rPr>
+        <w:t>:</w:t>
       </w:r>
     </w:p>
     <w:p>
@@ -1657,6 +1741,9 @@
         </w:rPr>
       </w:pPr>
       <w:r>
+        <w:rPr>
+          <w:noProof/>
+        </w:rPr>
         <w:drawing>
           <wp:inline distT="0" distB="0" distL="0" distR="0" wp14:anchorId="0AF2FDAA" wp14:editId="26FA0DFE">
             <wp:extent cx="3570136" cy="2271198"/>
@@ -1696,10 +1783,7 @@
     </w:p>
     <w:p>
       <w:r>
-        <w:t xml:space="preserve">Για παράδειγμα, αν προσπαθήσουμε να κατασκευάσουμε αυτήν την εικόνα, </w:t>
-      </w:r>
-      <w:r>
-        <w:t xml:space="preserve">η οποία είναι έχει όνομα </w:t>
+        <w:t xml:space="preserve">Για παράδειγμα, αν προσπαθήσουμε να κατασκευάσουμε αυτήν την εικόνα, η οποία είναι έχει όνομα </w:t>
       </w:r>
       <w:r>
         <w:rPr>
@@ -1757,6 +1841,7 @@
         <w:rPr>
           <w:b/>
           <w:bCs/>
+          <w:noProof/>
           <w:u w:val="single"/>
         </w:rPr>
         <w:lastRenderedPageBreak/>
@@ -1873,6 +1958,7 @@
           <w:sz w:val="40"/>
           <w:szCs w:val="40"/>
           <w:u w:val="single"/>
+          <w:lang w:val="en-US"/>
         </w:rPr>
       </w:pPr>
       <w:r>
@@ -1882,6 +1968,7 @@
           <w:sz w:val="40"/>
           <w:szCs w:val="40"/>
           <w:u w:val="single"/>
+          <w:lang w:val="en-US"/>
         </w:rPr>
         <w:t>4</w:t>
       </w:r>
@@ -1892,6 +1979,7 @@
           <w:sz w:val="40"/>
           <w:szCs w:val="40"/>
           <w:u w:val="single"/>
+          <w:lang w:val="en-US"/>
         </w:rPr>
         <w:t xml:space="preserve"> </w:t>
       </w:r>
@@ -1912,11 +2000,18 @@
           <w:sz w:val="40"/>
           <w:szCs w:val="40"/>
           <w:u w:val="single"/>
+          <w:lang w:val="en-US"/>
         </w:rPr>
         <w:t>:</w:t>
       </w:r>
     </w:p>
-    <w:p/>
+    <w:p>
+      <w:pPr>
+        <w:rPr>
+          <w:lang w:val="en-US"/>
+        </w:rPr>
+      </w:pPr>
+    </w:p>
     <w:p>
       <w:pPr>
         <w:rPr>
@@ -5027,6 +5122,11 @@
       </w:r>
     </w:p>
     <w:p>
+      <w:pPr>
+        <w:rPr>
+          <w:lang w:val="en-US"/>
+        </w:rPr>
+      </w:pPr>
       <w:r>
         <w:rPr>
           <w:lang w:val="en-US"/>
@@ -5043,7 +5143,13 @@
         <w:t xml:space="preserve"> border strip (5 layers × 4 borders)</w:t>
       </w:r>
     </w:p>
-    <w:p/>
+    <w:p>
+      <w:pPr>
+        <w:rPr>
+          <w:lang w:val="en-US"/>
+        </w:rPr>
+      </w:pPr>
+    </w:p>
     <w:p>
       <w:pPr>
         <w:rPr>
@@ -5098,11 +5204,6 @@
       </w:r>
     </w:p>
     <w:p>
-      <w:pPr>
-        <w:rPr>
-          <w:lang w:val="en-US"/>
-        </w:rPr>
-      </w:pPr>
       <w:r>
         <w:t xml:space="preserve">Στόχος: Για κάθε δύο κομμάτια σε ΟΛΕΣ τις πιθανές </w:t>
       </w:r>
@@ -5329,6 +5430,9 @@
     </w:p>
     <w:p>
       <w:r>
+        <w:rPr>
+          <w:lang w:val="en-US"/>
+        </w:rPr>
         <w:t xml:space="preserve">        </w:t>
       </w:r>
       <w:r>
@@ -5361,11 +5465,6 @@
       </w:r>
     </w:p>
     <w:p>
-      <w:pPr>
-        <w:rPr>
-          <w:lang w:val="en-US"/>
-        </w:rPr>
-      </w:pPr>
       <w:r>
         <w:t xml:space="preserve">          </w:t>
       </w:r>
@@ -5373,28 +5472,62 @@
         <w:t>Για</w:t>
       </w:r>
       <w:r>
-        <w:rPr>
-          <w:lang w:val="en-US"/>
-        </w:rPr>
         <w:t xml:space="preserve"> </w:t>
       </w:r>
       <w:r>
         <w:t>κάθε</w:t>
       </w:r>
       <w:r>
-        <w:rPr>
-          <w:lang w:val="en-US"/>
-        </w:rPr>
-        <w:t xml:space="preserve"> rotation </w:t>
+        <w:t xml:space="preserve"> </w:t>
+      </w:r>
+      <w:r>
+        <w:rPr>
+          <w:lang w:val="en-US"/>
+        </w:rPr>
+        <w:t>rotation</w:t>
+      </w:r>
+      <w:r>
+        <w:t xml:space="preserve"> </w:t>
       </w:r>
       <w:r>
         <w:t>του</w:t>
       </w:r>
       <w:r>
-        <w:rPr>
-          <w:lang w:val="en-US"/>
-        </w:rPr>
-        <w:t xml:space="preserve"> B (0°, 90°, 180°, 270°):</w:t>
+        <w:t xml:space="preserve"> </w:t>
+      </w:r>
+      <w:r>
+        <w:rPr>
+          <w:lang w:val="en-US"/>
+        </w:rPr>
+        <w:t>B</w:t>
+      </w:r>
+      <w:r>
+        <w:t xml:space="preserve"> (0°, 90°, 180°, 270°):</w:t>
+      </w:r>
+    </w:p>
+    <w:p>
+      <w:pPr>
+        <w:rPr>
+          <w:lang w:val="en-US"/>
+        </w:rPr>
+      </w:pPr>
+      <w:r>
+        <w:t xml:space="preserve">            </w:t>
+      </w:r>
+      <w:r>
+        <w:rPr>
+          <w:lang w:val="en-US"/>
+        </w:rPr>
+        <w:t xml:space="preserve">- </w:t>
+      </w:r>
+      <w:r>
+        <w:t>Υπολογισμός</w:t>
+      </w:r>
+      <w:r>
+        <w:rPr>
+          <w:lang w:val="en-US"/>
+        </w:rPr>
+        <w:t xml:space="preserve"> opposite border (top-bottom, right-left)</w:t>
       </w:r>
     </w:p>
     <w:p>
@@ -5410,87 +5543,65 @@
         <w:t xml:space="preserve">            - </w:t>
       </w:r>
       <w:r>
+        <w:t>Σύγκριση</w:t>
+      </w:r>
+      <w:r>
+        <w:rPr>
+          <w:lang w:val="en-US"/>
+        </w:rPr>
+        <w:t xml:space="preserve"> </w:t>
+      </w:r>
+      <w:proofErr w:type="spellStart"/>
+      <w:r>
+        <w:rPr>
+          <w:lang w:val="en-US"/>
+        </w:rPr>
+        <w:t>borderA</w:t>
+      </w:r>
+      <w:proofErr w:type="spellEnd"/>
+      <w:r>
+        <w:rPr>
+          <w:lang w:val="en-US"/>
+        </w:rPr>
+        <w:t xml:space="preserve"> </w:t>
+      </w:r>
+      <w:r>
+        <w:t>με</w:t>
+      </w:r>
+      <w:r>
+        <w:rPr>
+          <w:lang w:val="en-US"/>
+        </w:rPr>
+        <w:t xml:space="preserve"> </w:t>
+      </w:r>
+      <w:proofErr w:type="spellStart"/>
+      <w:r>
+        <w:rPr>
+          <w:lang w:val="en-US"/>
+        </w:rPr>
+        <w:t>borderB</w:t>
+      </w:r>
+      <w:proofErr w:type="spellEnd"/>
+    </w:p>
+    <w:p>
+      <w:pPr>
+        <w:rPr>
+          <w:lang w:val="en-US"/>
+        </w:rPr>
+      </w:pPr>
+      <w:r>
+        <w:rPr>
+          <w:lang w:val="en-US"/>
+        </w:rPr>
+        <w:t xml:space="preserve">            - </w:t>
+      </w:r>
+      <w:r>
         <w:t>Υπολογισμός</w:t>
       </w:r>
       <w:r>
         <w:rPr>
           <w:lang w:val="en-US"/>
         </w:rPr>
-        <w:t xml:space="preserve"> opposite border (top-bottom, right-left)</w:t>
-      </w:r>
-    </w:p>
-    <w:p>
-      <w:pPr>
-        <w:rPr>
-          <w:lang w:val="en-US"/>
-        </w:rPr>
-      </w:pPr>
-      <w:r>
-        <w:rPr>
-          <w:lang w:val="en-US"/>
-        </w:rPr>
-        <w:t xml:space="preserve">            - </w:t>
-      </w:r>
-      <w:r>
-        <w:t>Σύγκριση</w:t>
-      </w:r>
-      <w:r>
-        <w:rPr>
-          <w:lang w:val="en-US"/>
-        </w:rPr>
-        <w:t xml:space="preserve"> </w:t>
-      </w:r>
-      <w:proofErr w:type="spellStart"/>
-      <w:r>
-        <w:rPr>
-          <w:lang w:val="en-US"/>
-        </w:rPr>
-        <w:t>borderA</w:t>
-      </w:r>
-      <w:proofErr w:type="spellEnd"/>
-      <w:r>
-        <w:rPr>
-          <w:lang w:val="en-US"/>
-        </w:rPr>
-        <w:t xml:space="preserve"> </w:t>
-      </w:r>
-      <w:r>
-        <w:t>με</w:t>
-      </w:r>
-      <w:r>
-        <w:rPr>
-          <w:lang w:val="en-US"/>
-        </w:rPr>
-        <w:t xml:space="preserve"> </w:t>
-      </w:r>
-      <w:proofErr w:type="spellStart"/>
-      <w:r>
-        <w:rPr>
-          <w:lang w:val="en-US"/>
-        </w:rPr>
-        <w:t>borderB</w:t>
-      </w:r>
-      <w:proofErr w:type="spellEnd"/>
-    </w:p>
-    <w:p>
-      <w:pPr>
-        <w:rPr>
-          <w:lang w:val="en-US"/>
-        </w:rPr>
-      </w:pPr>
-      <w:r>
-        <w:rPr>
-          <w:lang w:val="en-US"/>
-        </w:rPr>
-        <w:t xml:space="preserve">            - </w:t>
-      </w:r>
-      <w:r>
-        <w:t>Υπολογισμός</w:t>
-      </w:r>
-      <w:r>
-        <w:rPr>
-          <w:lang w:val="en-US"/>
-        </w:rPr>
         <w:t xml:space="preserve"> compatibility score</w:t>
       </w:r>
     </w:p>
@@ -5527,10 +5638,13 @@
         </w:rPr>
       </w:pPr>
       <w:r>
-        <w:rPr>
-          <w:lang w:val="en-US"/>
-        </w:rPr>
-        <w:t xml:space="preserve">  - N tiles </w:t>
+        <w:t xml:space="preserve">  </w:t>
+      </w:r>
+      <w:r>
+        <w:rPr>
+          <w:lang w:val="en-US"/>
+        </w:rPr>
+        <w:t xml:space="preserve">- N tiles </w:t>
       </w:r>
       <w:r>
         <w:rPr>
@@ -6321,21 +6435,206 @@
         <w:t xml:space="preserve">     - </w:t>
       </w:r>
       <w:r>
+        <w:t>Χαμηλότερο</w:t>
+      </w:r>
+      <w:r>
+        <w:rPr>
+          <w:lang w:val="en-US"/>
+        </w:rPr>
+        <w:t xml:space="preserve"> = </w:t>
+      </w:r>
+      <w:r>
+        <w:t>καλύτερο</w:t>
+      </w:r>
+      <w:r>
+        <w:rPr>
+          <w:lang w:val="en-US"/>
+        </w:rPr>
+        <w:t xml:space="preserve"> (0 =</w:t>
+      </w:r>
+      <w:r>
+        <w:t>ίδια</w:t>
+      </w:r>
+      <w:r>
+        <w:rPr>
+          <w:lang w:val="en-US"/>
+        </w:rPr>
+        <w:t>)</w:t>
+      </w:r>
+    </w:p>
+    <w:p>
+      <w:pPr>
+        <w:rPr>
+          <w:lang w:val="en-US"/>
+        </w:rPr>
+      </w:pPr>
+      <w:r>
+        <w:rPr>
+          <w:lang w:val="en-US"/>
+        </w:rPr>
+        <w:t xml:space="preserve">     - Typical range: 0-2 </w:t>
+      </w:r>
+      <w:proofErr w:type="spellStart"/>
+      <w:r>
+        <w:rPr>
+          <w:lang w:val="en-US"/>
+        </w:rPr>
+        <w:t>γι</w:t>
+      </w:r>
+      <w:proofErr w:type="spellEnd"/>
+      <w:r>
+        <w:rPr>
+          <w:lang w:val="en-US"/>
+        </w:rPr>
+        <w:t>α normalized histograms</w:t>
+      </w:r>
+    </w:p>
+    <w:p>
+      <w:pPr>
+        <w:rPr>
+          <w:lang w:val="en-US"/>
+        </w:rPr>
+      </w:pPr>
+      <w:r>
+        <w:rPr>
+          <w:lang w:val="en-US"/>
+        </w:rPr>
+        <w:t xml:space="preserve">     - Normalization: distance &gt; similarity (1 - distance/</w:t>
+      </w:r>
+      <w:proofErr w:type="spellStart"/>
+      <w:r>
+        <w:rPr>
+          <w:lang w:val="en-US"/>
+        </w:rPr>
+        <w:t>max_distance</w:t>
+      </w:r>
+      <w:proofErr w:type="spellEnd"/>
+      <w:r>
+        <w:rPr>
+          <w:lang w:val="en-US"/>
+        </w:rPr>
+        <w:t>)</w:t>
+      </w:r>
+    </w:p>
+    <w:p>
+      <w:pPr>
+        <w:rPr>
+          <w:lang w:val="en-US"/>
+        </w:rPr>
+      </w:pPr>
+    </w:p>
+    <w:p>
+      <w:pPr>
+        <w:rPr>
+          <w:lang w:val="en-US"/>
+        </w:rPr>
+      </w:pPr>
+      <w:r>
+        <w:rPr>
+          <w:lang w:val="en-US"/>
+        </w:rPr>
+        <w:t xml:space="preserve">  2. Euclidean Distance (Gabor Features):</w:t>
+      </w:r>
+    </w:p>
+    <w:p>
+      <w:pPr>
+        <w:rPr>
+          <w:lang w:val="en-US"/>
+        </w:rPr>
+      </w:pPr>
+      <w:r>
+        <w:rPr>
+          <w:lang w:val="en-US"/>
+        </w:rPr>
+        <w:t xml:space="preserve">     - </w:t>
+      </w:r>
+      <w:proofErr w:type="spellStart"/>
+      <w:r>
+        <w:rPr>
+          <w:lang w:val="en-US"/>
+        </w:rPr>
+        <w:t>Χρησιμο</w:t>
+      </w:r>
+      <w:proofErr w:type="spellEnd"/>
+      <w:r>
+        <w:rPr>
+          <w:lang w:val="en-US"/>
+        </w:rPr>
+        <w:t xml:space="preserve">ποιείται </w:t>
+      </w:r>
+      <w:proofErr w:type="spellStart"/>
+      <w:r>
+        <w:rPr>
+          <w:lang w:val="en-US"/>
+        </w:rPr>
+        <w:t>γι</w:t>
+      </w:r>
+      <w:proofErr w:type="spellEnd"/>
+      <w:r>
+        <w:rPr>
+          <w:lang w:val="en-US"/>
+        </w:rPr>
+        <w:t>α Gabor texture features</w:t>
+      </w:r>
+    </w:p>
+    <w:p>
+      <w:r>
+        <w:rPr>
+          <w:lang w:val="en-US"/>
+        </w:rPr>
+        <w:t xml:space="preserve">     </w:t>
+      </w:r>
+      <w:r>
+        <w:t xml:space="preserve">- </w:t>
+      </w:r>
+      <w:r>
+        <w:rPr>
+          <w:lang w:val="en-US"/>
+        </w:rPr>
+        <w:t>L</w:t>
+      </w:r>
+      <w:r>
+        <w:t xml:space="preserve">2 </w:t>
+      </w:r>
+      <w:r>
+        <w:rPr>
+          <w:lang w:val="en-US"/>
+        </w:rPr>
+        <w:t>distance</w:t>
+      </w:r>
+      <w:r>
+        <w:t xml:space="preserve"> μεταξύ </w:t>
+      </w:r>
+      <w:r>
+        <w:rPr>
+          <w:lang w:val="en-US"/>
+        </w:rPr>
+        <w:t>feature</w:t>
+      </w:r>
+      <w:r>
+        <w:t xml:space="preserve"> </w:t>
+      </w:r>
+      <w:r>
+        <w:rPr>
+          <w:lang w:val="en-US"/>
+        </w:rPr>
+        <w:t>vectors</w:t>
+      </w:r>
+    </w:p>
+    <w:p>
+      <w:r>
+        <w:t xml:space="preserve">     - </w:t>
+      </w:r>
+      <w:r>
         <w:t>Χαμηλότερο = καλύτερο</w:t>
       </w:r>
       <w:r>
-        <w:rPr>
-          <w:lang w:val="en-US"/>
-        </w:rPr>
         <w:t xml:space="preserve"> (0 =</w:t>
       </w:r>
       <w:r>
         <w:t>ίδια</w:t>
       </w:r>
       <w:r>
-        <w:rPr>
-          <w:lang w:val="en-US"/>
-        </w:rPr>
         <w:t>)</w:t>
       </w:r>
     </w:p>
@@ -6346,10 +6645,74 @@
         </w:rPr>
       </w:pPr>
       <w:r>
-        <w:rPr>
-          <w:lang w:val="en-US"/>
-        </w:rPr>
-        <w:t xml:space="preserve">     - Typical range: 0-2 </w:t>
+        <w:t xml:space="preserve">     </w:t>
+      </w:r>
+      <w:r>
+        <w:rPr>
+          <w:lang w:val="en-US"/>
+        </w:rPr>
+        <w:t>- Normalization: distance &gt; similarity (1 - distance/</w:t>
+      </w:r>
+      <w:proofErr w:type="spellStart"/>
+      <w:r>
+        <w:rPr>
+          <w:lang w:val="en-US"/>
+        </w:rPr>
+        <w:t>max_distance</w:t>
+      </w:r>
+      <w:proofErr w:type="spellEnd"/>
+      <w:r>
+        <w:rPr>
+          <w:lang w:val="en-US"/>
+        </w:rPr>
+        <w:t>)</w:t>
+      </w:r>
+    </w:p>
+    <w:p>
+      <w:pPr>
+        <w:rPr>
+          <w:lang w:val="en-US"/>
+        </w:rPr>
+      </w:pPr>
+    </w:p>
+    <w:p>
+      <w:pPr>
+        <w:rPr>
+          <w:lang w:val="en-US"/>
+        </w:rPr>
+      </w:pPr>
+      <w:r>
+        <w:rPr>
+          <w:lang w:val="en-US"/>
+        </w:rPr>
+        <w:t xml:space="preserve">  3. Cosine Similarity (CNN Features):</w:t>
+      </w:r>
+    </w:p>
+    <w:p>
+      <w:pPr>
+        <w:rPr>
+          <w:lang w:val="en-US"/>
+        </w:rPr>
+      </w:pPr>
+      <w:r>
+        <w:rPr>
+          <w:lang w:val="en-US"/>
+        </w:rPr>
+        <w:t xml:space="preserve">     - </w:t>
+      </w:r>
+      <w:proofErr w:type="spellStart"/>
+      <w:r>
+        <w:rPr>
+          <w:lang w:val="en-US"/>
+        </w:rPr>
+        <w:t>Χρησιμο</w:t>
+      </w:r>
+      <w:proofErr w:type="spellEnd"/>
+      <w:r>
+        <w:rPr>
+          <w:lang w:val="en-US"/>
+        </w:rPr>
+        <w:t xml:space="preserve">ποιείται </w:t>
       </w:r>
       <w:proofErr w:type="spellStart"/>
       <w:r>
@@ -6363,54 +6726,99 @@
         <w:rPr>
           <w:lang w:val="en-US"/>
         </w:rPr>
-        <w:t>α normalized histograms</w:t>
-      </w:r>
-    </w:p>
-    <w:p>
-      <w:pPr>
-        <w:rPr>
-          <w:lang w:val="en-US"/>
-        </w:rPr>
-      </w:pPr>
-      <w:r>
-        <w:rPr>
-          <w:lang w:val="en-US"/>
-        </w:rPr>
-        <w:t xml:space="preserve">     - Normalization: distance &gt; similarity (1 - distance/</w:t>
-      </w:r>
-      <w:proofErr w:type="spellStart"/>
-      <w:r>
-        <w:rPr>
-          <w:lang w:val="en-US"/>
-        </w:rPr>
-        <w:t>max_distance</w:t>
-      </w:r>
-      <w:proofErr w:type="spellEnd"/>
-      <w:r>
-        <w:rPr>
-          <w:lang w:val="en-US"/>
-        </w:rPr>
-        <w:t>)</w:t>
-      </w:r>
-    </w:p>
-    <w:p>
-      <w:pPr>
-        <w:rPr>
-          <w:lang w:val="en-US"/>
-        </w:rPr>
-      </w:pPr>
-    </w:p>
-    <w:p>
-      <w:pPr>
-        <w:rPr>
-          <w:lang w:val="en-US"/>
-        </w:rPr>
-      </w:pPr>
-      <w:r>
-        <w:rPr>
-          <w:lang w:val="en-US"/>
-        </w:rPr>
-        <w:t xml:space="preserve">  2. Euclidean Distance (Gabor Features):</w:t>
+        <w:t>α deep CNN features</w:t>
+      </w:r>
+    </w:p>
+    <w:p>
+      <w:r>
+        <w:rPr>
+          <w:lang w:val="en-US"/>
+        </w:rPr>
+        <w:t xml:space="preserve">     </w:t>
+      </w:r>
+      <w:r>
+        <w:t xml:space="preserve">- Μετράει το </w:t>
+      </w:r>
+      <w:r>
+        <w:rPr>
+          <w:lang w:val="en-US"/>
+        </w:rPr>
+        <w:t>cosine</w:t>
+      </w:r>
+      <w:r>
+        <w:t xml:space="preserve"> της γωνίας μεταξύ </w:t>
+      </w:r>
+      <w:r>
+        <w:rPr>
+          <w:lang w:val="en-US"/>
+        </w:rPr>
+        <w:t>vectors</w:t>
+      </w:r>
+    </w:p>
+    <w:p>
+      <w:r>
+        <w:t xml:space="preserve">     - Τύπος: </w:t>
+      </w:r>
+      <w:r>
+        <w:rPr>
+          <w:lang w:val="en-US"/>
+        </w:rPr>
+        <w:t>cos</w:t>
+      </w:r>
+      <w:r>
+        <w:t>(θ) = (</w:t>
+      </w:r>
+      <w:r>
+        <w:rPr>
+          <w:lang w:val="en-US"/>
+        </w:rPr>
+        <w:t>v</w:t>
+      </w:r>
+      <w:r>
+        <w:t xml:space="preserve">1 · </w:t>
+      </w:r>
+      <w:r>
+        <w:rPr>
+          <w:lang w:val="en-US"/>
+        </w:rPr>
+        <w:t>v</w:t>
+      </w:r>
+      <w:r>
+        <w:t>2) / (||</w:t>
+      </w:r>
+      <w:r>
+        <w:rPr>
+          <w:lang w:val="en-US"/>
+        </w:rPr>
+        <w:t>v</w:t>
+      </w:r>
+      <w:r>
+        <w:t>1|| * ||</w:t>
+      </w:r>
+      <w:r>
+        <w:rPr>
+          <w:lang w:val="en-US"/>
+        </w:rPr>
+        <w:t>v</w:t>
+      </w:r>
+      <w:r>
+        <w:t>2||)</w:t>
+      </w:r>
+    </w:p>
+    <w:p>
+      <w:pPr>
+        <w:rPr>
+          <w:lang w:val="en-US"/>
+        </w:rPr>
+      </w:pPr>
+      <w:r>
+        <w:t xml:space="preserve">     </w:t>
+      </w:r>
+      <w:r>
+        <w:rPr>
+          <w:lang w:val="en-US"/>
+        </w:rPr>
+        <w:t>- Range: 0-1 (higher is better, 1 = identical direction)</w:t>
       </w:r>
     </w:p>
     <w:p>
@@ -6430,280 +6838,6 @@
         <w:rPr>
           <w:lang w:val="en-US"/>
         </w:rPr>
-        <w:t>Χρησιμο</w:t>
-      </w:r>
-      <w:proofErr w:type="spellEnd"/>
-      <w:r>
-        <w:rPr>
-          <w:lang w:val="en-US"/>
-        </w:rPr>
-        <w:t xml:space="preserve">ποιείται </w:t>
-      </w:r>
-      <w:proofErr w:type="spellStart"/>
-      <w:r>
-        <w:rPr>
-          <w:lang w:val="en-US"/>
-        </w:rPr>
-        <w:t>γι</w:t>
-      </w:r>
-      <w:proofErr w:type="spellEnd"/>
-      <w:r>
-        <w:rPr>
-          <w:lang w:val="en-US"/>
-        </w:rPr>
-        <w:t>α Gabor texture features</w:t>
-      </w:r>
-    </w:p>
-    <w:p>
-      <w:pPr>
-        <w:rPr>
-          <w:lang w:val="en-US"/>
-        </w:rPr>
-      </w:pPr>
-      <w:r>
-        <w:rPr>
-          <w:lang w:val="en-US"/>
-        </w:rPr>
-        <w:t xml:space="preserve">     - L2 distance </w:t>
-      </w:r>
-      <w:proofErr w:type="spellStart"/>
-      <w:r>
-        <w:rPr>
-          <w:lang w:val="en-US"/>
-        </w:rPr>
-        <w:t>μετ</w:t>
-      </w:r>
-      <w:proofErr w:type="spellEnd"/>
-      <w:r>
-        <w:rPr>
-          <w:lang w:val="en-US"/>
-        </w:rPr>
-        <w:t>αξύ feature vectors</w:t>
-      </w:r>
-    </w:p>
-    <w:p>
-      <w:pPr>
-        <w:rPr>
-          <w:lang w:val="en-US"/>
-        </w:rPr>
-      </w:pPr>
-      <w:r>
-        <w:rPr>
-          <w:lang w:val="en-US"/>
-        </w:rPr>
-        <w:t xml:space="preserve">     - </w:t>
-      </w:r>
-      <w:r>
-        <w:t>Χαμηλότερο = καλύτερο</w:t>
-      </w:r>
-      <w:r>
-        <w:rPr>
-          <w:lang w:val="en-US"/>
-        </w:rPr>
-        <w:t xml:space="preserve"> (0 =</w:t>
-      </w:r>
-      <w:r>
-        <w:t>ίδια</w:t>
-      </w:r>
-      <w:r>
-        <w:rPr>
-          <w:lang w:val="en-US"/>
-        </w:rPr>
-        <w:t>)</w:t>
-      </w:r>
-    </w:p>
-    <w:p>
-      <w:pPr>
-        <w:rPr>
-          <w:lang w:val="en-US"/>
-        </w:rPr>
-      </w:pPr>
-      <w:r>
-        <w:rPr>
-          <w:lang w:val="en-US"/>
-        </w:rPr>
-        <w:t xml:space="preserve">     - Normalization: distance &gt; similarity (1 - distance/</w:t>
-      </w:r>
-      <w:proofErr w:type="spellStart"/>
-      <w:r>
-        <w:rPr>
-          <w:lang w:val="en-US"/>
-        </w:rPr>
-        <w:t>max_distance</w:t>
-      </w:r>
-      <w:proofErr w:type="spellEnd"/>
-      <w:r>
-        <w:rPr>
-          <w:lang w:val="en-US"/>
-        </w:rPr>
-        <w:t>)</w:t>
-      </w:r>
-    </w:p>
-    <w:p>
-      <w:pPr>
-        <w:rPr>
-          <w:lang w:val="en-US"/>
-        </w:rPr>
-      </w:pPr>
-    </w:p>
-    <w:p>
-      <w:pPr>
-        <w:rPr>
-          <w:lang w:val="en-US"/>
-        </w:rPr>
-      </w:pPr>
-      <w:r>
-        <w:rPr>
-          <w:lang w:val="en-US"/>
-        </w:rPr>
-        <w:t xml:space="preserve">  3. Cosine Similarity (CNN Features):</w:t>
-      </w:r>
-    </w:p>
-    <w:p>
-      <w:pPr>
-        <w:rPr>
-          <w:lang w:val="en-US"/>
-        </w:rPr>
-      </w:pPr>
-      <w:r>
-        <w:rPr>
-          <w:lang w:val="en-US"/>
-        </w:rPr>
-        <w:t xml:space="preserve">     - </w:t>
-      </w:r>
-      <w:proofErr w:type="spellStart"/>
-      <w:r>
-        <w:rPr>
-          <w:lang w:val="en-US"/>
-        </w:rPr>
-        <w:t>Χρησιμο</w:t>
-      </w:r>
-      <w:proofErr w:type="spellEnd"/>
-      <w:r>
-        <w:rPr>
-          <w:lang w:val="en-US"/>
-        </w:rPr>
-        <w:t xml:space="preserve">ποιείται </w:t>
-      </w:r>
-      <w:proofErr w:type="spellStart"/>
-      <w:r>
-        <w:rPr>
-          <w:lang w:val="en-US"/>
-        </w:rPr>
-        <w:t>γι</w:t>
-      </w:r>
-      <w:proofErr w:type="spellEnd"/>
-      <w:r>
-        <w:rPr>
-          <w:lang w:val="en-US"/>
-        </w:rPr>
-        <w:t>α deep CNN features</w:t>
-      </w:r>
-    </w:p>
-    <w:p>
-      <w:r>
-        <w:rPr>
-          <w:lang w:val="en-US"/>
-        </w:rPr>
-        <w:t xml:space="preserve">     </w:t>
-      </w:r>
-      <w:r>
-        <w:t xml:space="preserve">- Μετράει το </w:t>
-      </w:r>
-      <w:r>
-        <w:rPr>
-          <w:lang w:val="en-US"/>
-        </w:rPr>
-        <w:t>cosine</w:t>
-      </w:r>
-      <w:r>
-        <w:t xml:space="preserve"> της γωνίας μεταξύ </w:t>
-      </w:r>
-      <w:r>
-        <w:rPr>
-          <w:lang w:val="en-US"/>
-        </w:rPr>
-        <w:t>vectors</w:t>
-      </w:r>
-    </w:p>
-    <w:p>
-      <w:r>
-        <w:t xml:space="preserve">     - Τύπος: </w:t>
-      </w:r>
-      <w:r>
-        <w:rPr>
-          <w:lang w:val="en-US"/>
-        </w:rPr>
-        <w:t>cos</w:t>
-      </w:r>
-      <w:r>
-        <w:t>(θ) = (</w:t>
-      </w:r>
-      <w:r>
-        <w:rPr>
-          <w:lang w:val="en-US"/>
-        </w:rPr>
-        <w:t>v</w:t>
-      </w:r>
-      <w:r>
-        <w:t xml:space="preserve">1 · </w:t>
-      </w:r>
-      <w:r>
-        <w:rPr>
-          <w:lang w:val="en-US"/>
-        </w:rPr>
-        <w:t>v</w:t>
-      </w:r>
-      <w:r>
-        <w:t>2) / (||</w:t>
-      </w:r>
-      <w:r>
-        <w:rPr>
-          <w:lang w:val="en-US"/>
-        </w:rPr>
-        <w:t>v</w:t>
-      </w:r>
-      <w:r>
-        <w:t>1|| * ||</w:t>
-      </w:r>
-      <w:r>
-        <w:rPr>
-          <w:lang w:val="en-US"/>
-        </w:rPr>
-        <w:t>v</w:t>
-      </w:r>
-      <w:r>
-        <w:t>2||)</w:t>
-      </w:r>
-    </w:p>
-    <w:p>
-      <w:pPr>
-        <w:rPr>
-          <w:lang w:val="en-US"/>
-        </w:rPr>
-      </w:pPr>
-      <w:r>
-        <w:t xml:space="preserve">     </w:t>
-      </w:r>
-      <w:r>
-        <w:rPr>
-          <w:lang w:val="en-US"/>
-        </w:rPr>
-        <w:t>- Range: 0-1 (higher is better, 1 = identical direction)</w:t>
-      </w:r>
-    </w:p>
-    <w:p>
-      <w:r>
-        <w:rPr>
-          <w:lang w:val="en-US"/>
-        </w:rPr>
-        <w:t xml:space="preserve">     - </w:t>
-      </w:r>
-      <w:proofErr w:type="spellStart"/>
-      <w:r>
-        <w:rPr>
-          <w:lang w:val="en-US"/>
-        </w:rPr>
         <w:t>Ήδη</w:t>
       </w:r>
       <w:proofErr w:type="spellEnd"/>
@@ -6742,7 +6876,13 @@
         <w:t>αι normalization)</w:t>
       </w:r>
     </w:p>
-    <w:p/>
+    <w:p>
+      <w:pPr>
+        <w:rPr>
+          <w:lang w:val="en-US"/>
+        </w:rPr>
+      </w:pPr>
+    </w:p>
     <w:p>
       <w:pPr>
         <w:rPr>
@@ -7069,6 +7209,11 @@
       </w:r>
     </w:p>
     <w:p>
+      <w:pPr>
+        <w:rPr>
+          <w:lang w:val="en-US"/>
+        </w:rPr>
+      </w:pPr>
       <w:r>
         <w:rPr>
           <w:lang w:val="en-US"/>
@@ -7077,6 +7222,11 @@
       </w:r>
     </w:p>
     <w:p>
+      <w:pPr>
+        <w:rPr>
+          <w:lang w:val="en-US"/>
+        </w:rPr>
+      </w:pPr>
       <w:r>
         <w:rPr>
           <w:lang w:val="en-US"/>
@@ -7163,6 +7313,11 @@
       <w:proofErr w:type="spellEnd"/>
     </w:p>
     <w:p>
+      <w:pPr>
+        <w:rPr>
+          <w:lang w:val="en-US"/>
+        </w:rPr>
+      </w:pPr>
       <w:r>
         <w:rPr>
           <w:lang w:val="en-US"/>
@@ -7681,6 +7836,11 @@
       </w:r>
     </w:p>
     <w:p>
+      <w:pPr>
+        <w:rPr>
+          <w:lang w:val="en-US"/>
+        </w:rPr>
+      </w:pPr>
       <w:r>
         <w:rPr>
           <w:lang w:val="en-US"/>
@@ -7688,7 +7848,13 @@
         <w:t xml:space="preserve">  - Best overall match</w:t>
       </w:r>
     </w:p>
-    <w:p/>
+    <w:p>
+      <w:pPr>
+        <w:rPr>
+          <w:lang w:val="en-US"/>
+        </w:rPr>
+      </w:pPr>
+    </w:p>
     <w:p>
       <w:pPr>
         <w:rPr>
@@ -7804,19 +7970,7 @@
         <w:rPr>
           <w:lang w:val="en-US"/>
         </w:rPr>
-        <w:t xml:space="preserve"> 3</w:t>
-      </w:r>
-      <w:r>
-        <w:rPr>
-          <w:lang w:val="en-US"/>
-        </w:rPr>
-        <w:t>*</w:t>
-      </w:r>
-      <w:r>
-        <w:rPr>
-          <w:lang w:val="en-US"/>
-        </w:rPr>
-        <w:t>3 grid)</w:t>
+        <w:t xml:space="preserve"> 3*3 grid)</w:t>
       </w:r>
     </w:p>
     <w:p>
@@ -8252,6 +8406,11 @@
       </w:r>
     </w:p>
     <w:p>
+      <w:pPr>
+        <w:rPr>
+          <w:lang w:val="en-US"/>
+        </w:rPr>
+      </w:pPr>
       <w:r>
         <w:rPr>
           <w:lang w:val="en-US"/>
@@ -9179,14 +9338,324 @@
         <w:rPr>
           <w:lang w:val="en-US"/>
         </w:rPr>
-        <w:t xml:space="preserve">d. Temperature Cooling: T = T </w:t>
-      </w:r>
-      <w:r>
-        <w:rPr>
-          <w:lang w:val="en-US"/>
-        </w:rPr>
-        <w:t>*</w:t>
-      </w:r>
+        <w:t xml:space="preserve">d. Temperature Cooling: T = T * </w:t>
+      </w:r>
+      <w:proofErr w:type="spellStart"/>
+      <w:r>
+        <w:rPr>
+          <w:lang w:val="en-US"/>
+        </w:rPr>
+        <w:t>cooling_rate</w:t>
+      </w:r>
+      <w:proofErr w:type="spellEnd"/>
+    </w:p>
+    <w:p>
+      <w:pPr>
+        <w:rPr>
+          <w:lang w:val="en-US"/>
+        </w:rPr>
+      </w:pPr>
+      <w:r>
+        <w:rPr>
+          <w:lang w:val="en-US"/>
+        </w:rPr>
+        <w:t xml:space="preserve">     e. Track best solution ever found</w:t>
+      </w:r>
+    </w:p>
+    <w:p>
+      <w:pPr>
+        <w:rPr>
+          <w:lang w:val="en-US"/>
+        </w:rPr>
+      </w:pPr>
+      <w:r>
+        <w:rPr>
+          <w:lang w:val="en-US"/>
+        </w:rPr>
+        <w:t xml:space="preserve">  4. Return: Best configuration found</w:t>
+      </w:r>
+    </w:p>
+    <w:p>
+      <w:pPr>
+        <w:rPr>
+          <w:lang w:val="en-US"/>
+        </w:rPr>
+      </w:pPr>
+    </w:p>
+    <w:p>
+      <w:pPr>
+        <w:rPr>
+          <w:lang w:val="en-US"/>
+        </w:rPr>
+      </w:pPr>
+      <w:r>
+        <w:rPr>
+          <w:lang w:val="en-US"/>
+        </w:rPr>
+        <w:t xml:space="preserve">  Energy Function (ΕΝΗΜΕΡΩΜΕΝΟΣ):</w:t>
+      </w:r>
+    </w:p>
+    <w:p>
+      <w:pPr>
+        <w:rPr>
+          <w:lang w:val="en-US"/>
+        </w:rPr>
+      </w:pPr>
+      <w:r>
+        <w:rPr>
+          <w:lang w:val="en-US"/>
+        </w:rPr>
+        <w:t xml:space="preserve">  </w:t>
+      </w:r>
+      <w:proofErr w:type="spellStart"/>
+      <w:r>
+        <w:rPr>
+          <w:lang w:val="en-US"/>
+        </w:rPr>
+        <w:t>Γι</w:t>
+      </w:r>
+      <w:proofErr w:type="spellEnd"/>
+      <w:r>
+        <w:rPr>
+          <w:lang w:val="en-US"/>
+        </w:rPr>
+        <w:t xml:space="preserve">α </w:t>
+      </w:r>
+      <w:proofErr w:type="spellStart"/>
+      <w:r>
+        <w:rPr>
+          <w:lang w:val="en-US"/>
+        </w:rPr>
+        <w:t>κάθε</w:t>
+      </w:r>
+      <w:proofErr w:type="spellEnd"/>
+      <w:r>
+        <w:rPr>
+          <w:lang w:val="en-US"/>
+        </w:rPr>
+        <w:t xml:space="preserve"> tile position (row, col):</w:t>
+      </w:r>
+    </w:p>
+    <w:p>
+      <w:pPr>
+        <w:rPr>
+          <w:lang w:val="en-US"/>
+        </w:rPr>
+      </w:pPr>
+      <w:r>
+        <w:rPr>
+          <w:lang w:val="en-US"/>
+        </w:rPr>
+        <w:t xml:space="preserve">  - Right neighbor compatibility:</w:t>
+      </w:r>
+    </w:p>
+    <w:p>
+      <w:pPr>
+        <w:rPr>
+          <w:lang w:val="en-US"/>
+        </w:rPr>
+      </w:pPr>
+      <w:r>
+        <w:rPr>
+          <w:lang w:val="en-US"/>
+        </w:rPr>
+        <w:t xml:space="preserve">    * matches = </w:t>
+      </w:r>
+      <w:proofErr w:type="gramStart"/>
+      <w:r>
+        <w:rPr>
+          <w:lang w:val="en-US"/>
+        </w:rPr>
+        <w:t>filter(</w:t>
+      </w:r>
+      <w:proofErr w:type="gramEnd"/>
+      <w:r>
+        <w:rPr>
+          <w:lang w:val="en-US"/>
+        </w:rPr>
+        <w:t xml:space="preserve">adjacency, </w:t>
+      </w:r>
+      <w:proofErr w:type="spellStart"/>
+      <w:r>
+        <w:rPr>
+          <w:lang w:val="en-US"/>
+        </w:rPr>
+        <w:t>tileA</w:t>
+      </w:r>
+      <w:proofErr w:type="spellEnd"/>
+      <w:r>
+        <w:rPr>
+          <w:lang w:val="en-US"/>
+        </w:rPr>
+        <w:t xml:space="preserve">=current, </w:t>
+      </w:r>
+      <w:proofErr w:type="spellStart"/>
+      <w:r>
+        <w:rPr>
+          <w:lang w:val="en-US"/>
+        </w:rPr>
+        <w:t>rotationA</w:t>
+      </w:r>
+      <w:proofErr w:type="spellEnd"/>
+      <w:r>
+        <w:rPr>
+          <w:lang w:val="en-US"/>
+        </w:rPr>
+        <w:t>=</w:t>
+      </w:r>
+      <w:proofErr w:type="spellStart"/>
+      <w:r>
+        <w:rPr>
+          <w:lang w:val="en-US"/>
+        </w:rPr>
+        <w:t>current.rotation</w:t>
+      </w:r>
+      <w:proofErr w:type="spellEnd"/>
+      <w:r>
+        <w:rPr>
+          <w:lang w:val="en-US"/>
+        </w:rPr>
+        <w:t xml:space="preserve">, </w:t>
+      </w:r>
+      <w:proofErr w:type="spellStart"/>
+      <w:r>
+        <w:rPr>
+          <w:lang w:val="en-US"/>
+        </w:rPr>
+        <w:t>borderA</w:t>
+      </w:r>
+      <w:proofErr w:type="spellEnd"/>
+      <w:r>
+        <w:rPr>
+          <w:lang w:val="en-US"/>
+        </w:rPr>
+        <w:t xml:space="preserve">='right', </w:t>
+      </w:r>
+      <w:proofErr w:type="spellStart"/>
+      <w:r>
+        <w:rPr>
+          <w:lang w:val="en-US"/>
+        </w:rPr>
+        <w:t>tileB</w:t>
+      </w:r>
+      <w:proofErr w:type="spellEnd"/>
+      <w:r>
+        <w:rPr>
+          <w:lang w:val="en-US"/>
+        </w:rPr>
+        <w:t>=</w:t>
+      </w:r>
+      <w:proofErr w:type="spellStart"/>
+      <w:r>
+        <w:rPr>
+          <w:lang w:val="en-US"/>
+        </w:rPr>
+        <w:t>rightTile</w:t>
+      </w:r>
+      <w:proofErr w:type="spellEnd"/>
+      <w:r>
+        <w:rPr>
+          <w:lang w:val="en-US"/>
+        </w:rPr>
+        <w:t xml:space="preserve">, </w:t>
+      </w:r>
+      <w:proofErr w:type="spellStart"/>
+      <w:r>
+        <w:rPr>
+          <w:lang w:val="en-US"/>
+        </w:rPr>
+        <w:t>rotationB</w:t>
+      </w:r>
+      <w:proofErr w:type="spellEnd"/>
+      <w:r>
+        <w:rPr>
+          <w:lang w:val="en-US"/>
+        </w:rPr>
+        <w:t>=</w:t>
+      </w:r>
+      <w:proofErr w:type="spellStart"/>
+      <w:r>
+        <w:rPr>
+          <w:lang w:val="en-US"/>
+        </w:rPr>
+        <w:t>rightTile.rotation</w:t>
+      </w:r>
+      <w:proofErr w:type="spellEnd"/>
+      <w:r>
+        <w:rPr>
+          <w:lang w:val="en-US"/>
+        </w:rPr>
+        <w:t>)</w:t>
+      </w:r>
+    </w:p>
+    <w:p>
+      <w:pPr>
+        <w:rPr>
+          <w:lang w:val="en-US"/>
+        </w:rPr>
+      </w:pPr>
+      <w:r>
+        <w:rPr>
+          <w:lang w:val="en-US"/>
+        </w:rPr>
+        <w:t xml:space="preserve">    * </w:t>
+      </w:r>
+      <w:proofErr w:type="gramStart"/>
+      <w:r>
+        <w:rPr>
+          <w:lang w:val="en-US"/>
+        </w:rPr>
+        <w:t>energy</w:t>
+      </w:r>
+      <w:proofErr w:type="gramEnd"/>
+      <w:r>
+        <w:rPr>
+          <w:lang w:val="en-US"/>
+        </w:rPr>
+        <w:t xml:space="preserve"> -= </w:t>
+      </w:r>
+      <w:proofErr w:type="spellStart"/>
+      <w:r>
+        <w:rPr>
+          <w:lang w:val="en-US"/>
+        </w:rPr>
+        <w:t>bestMatch.compatibilityScore</w:t>
+      </w:r>
+      <w:proofErr w:type="spellEnd"/>
+    </w:p>
+    <w:p>
+      <w:pPr>
+        <w:rPr>
+          <w:lang w:val="en-US"/>
+        </w:rPr>
+      </w:pPr>
+      <w:r>
+        <w:rPr>
+          <w:lang w:val="en-US"/>
+        </w:rPr>
+        <w:t xml:space="preserve">  - Bottom neighbor compatibility:</w:t>
+      </w:r>
+    </w:p>
+    <w:p>
+      <w:pPr>
+        <w:rPr>
+          <w:lang w:val="en-US"/>
+        </w:rPr>
+      </w:pPr>
+      <w:r>
+        <w:rPr>
+          <w:lang w:val="en-US"/>
+        </w:rPr>
+        <w:t xml:space="preserve">    * Similar logic </w:t>
+      </w:r>
+      <w:proofErr w:type="spellStart"/>
+      <w:r>
+        <w:rPr>
+          <w:lang w:val="en-US"/>
+        </w:rPr>
+        <w:t>με</w:t>
+      </w:r>
+      <w:proofErr w:type="spellEnd"/>
       <w:r>
         <w:rPr>
           <w:lang w:val="en-US"/>
@@ -9198,54 +9667,68 @@
         <w:rPr>
           <w:lang w:val="en-US"/>
         </w:rPr>
-        <w:t>cooling_rate</w:t>
-      </w:r>
-      <w:proofErr w:type="spellEnd"/>
-    </w:p>
-    <w:p>
-      <w:pPr>
-        <w:rPr>
-          <w:lang w:val="en-US"/>
-        </w:rPr>
-      </w:pPr>
-      <w:r>
-        <w:rPr>
-          <w:lang w:val="en-US"/>
-        </w:rPr>
-        <w:t xml:space="preserve">     e. Track best solution ever found</w:t>
-      </w:r>
-    </w:p>
-    <w:p>
-      <w:pPr>
-        <w:rPr>
-          <w:lang w:val="en-US"/>
-        </w:rPr>
-      </w:pPr>
-      <w:r>
-        <w:rPr>
-          <w:lang w:val="en-US"/>
-        </w:rPr>
-        <w:t xml:space="preserve">  4. Return: Best configuration found</w:t>
-      </w:r>
-    </w:p>
-    <w:p>
-      <w:pPr>
-        <w:rPr>
-          <w:lang w:val="en-US"/>
-        </w:rPr>
-      </w:pPr>
-    </w:p>
-    <w:p>
-      <w:pPr>
-        <w:rPr>
-          <w:lang w:val="en-US"/>
-        </w:rPr>
-      </w:pPr>
-      <w:r>
-        <w:rPr>
-          <w:lang w:val="en-US"/>
-        </w:rPr>
-        <w:t xml:space="preserve">  Energy Function (ΕΝΗΜΕΡΩΜΕΝΟΣ):</w:t>
+        <w:t>borderA</w:t>
+      </w:r>
+      <w:proofErr w:type="spellEnd"/>
+      <w:r>
+        <w:rPr>
+          <w:lang w:val="en-US"/>
+        </w:rPr>
+        <w:t>='bottom'</w:t>
+      </w:r>
+    </w:p>
+    <w:p>
+      <w:pPr>
+        <w:rPr>
+          <w:lang w:val="en-US"/>
+        </w:rPr>
+      </w:pPr>
+    </w:p>
+    <w:p>
+      <w:pPr>
+        <w:rPr>
+          <w:lang w:val="en-US"/>
+        </w:rPr>
+      </w:pPr>
+      <w:r>
+        <w:rPr>
+          <w:lang w:val="en-US"/>
+        </w:rPr>
+        <w:t xml:space="preserve">  Total Energy = -</w:t>
+      </w:r>
+      <w:proofErr w:type="gramStart"/>
+      <w:r>
+        <w:rPr>
+          <w:lang w:val="en-US"/>
+        </w:rPr>
+        <w:t>Σ(</w:t>
+      </w:r>
+      <w:proofErr w:type="gramEnd"/>
+      <w:r>
+        <w:rPr>
+          <w:lang w:val="en-US"/>
+        </w:rPr>
+        <w:t>all neighbor compatibilities)</w:t>
+      </w:r>
+    </w:p>
+    <w:p>
+      <w:pPr>
+        <w:rPr>
+          <w:lang w:val="en-US"/>
+        </w:rPr>
+      </w:pPr>
+    </w:p>
+    <w:p>
+      <w:pPr>
+        <w:rPr>
+          <w:lang w:val="en-US"/>
+        </w:rPr>
+      </w:pPr>
+      <w:r>
+        <w:rPr>
+          <w:lang w:val="en-US"/>
+        </w:rPr>
+        <w:t xml:space="preserve">  Comparison Metrics:</w:t>
       </w:r>
     </w:p>
     <w:p>
@@ -9260,571 +9743,326 @@
         </w:rPr>
         <w:t xml:space="preserve">  </w:t>
       </w:r>
-      <w:proofErr w:type="spellStart"/>
-      <w:r>
-        <w:rPr>
-          <w:lang w:val="en-US"/>
-        </w:rPr>
-        <w:t>Γι</w:t>
-      </w:r>
-      <w:proofErr w:type="spellEnd"/>
-      <w:r>
-        <w:rPr>
-          <w:lang w:val="en-US"/>
-        </w:rPr>
-        <w:t xml:space="preserve">α </w:t>
-      </w:r>
-      <w:proofErr w:type="spellStart"/>
-      <w:r>
-        <w:rPr>
-          <w:lang w:val="en-US"/>
-        </w:rPr>
+      <w:r>
+        <w:t>Και</w:t>
+      </w:r>
+      <w:r>
+        <w:rPr>
+          <w:lang w:val="en-US"/>
+        </w:rPr>
+        <w:t xml:space="preserve"> </w:t>
+      </w:r>
+      <w:r>
+        <w:t>οι</w:t>
+      </w:r>
+      <w:r>
+        <w:rPr>
+          <w:lang w:val="en-US"/>
+        </w:rPr>
+        <w:t xml:space="preserve"> 2 </w:t>
+      </w:r>
+      <w:r>
+        <w:rPr>
+          <w:lang w:val="en-US"/>
+        </w:rPr>
+        <w:t>algorithms</w:t>
+      </w:r>
+      <w:r>
+        <w:rPr>
+          <w:lang w:val="en-US"/>
+        </w:rPr>
+        <w:t xml:space="preserve"> </w:t>
+      </w:r>
+      <w:r>
+        <w:t>εμφανίζονται</w:t>
+      </w:r>
+      <w:r>
+        <w:rPr>
+          <w:lang w:val="en-US"/>
+        </w:rPr>
+        <w:t xml:space="preserve"> </w:t>
+      </w:r>
+      <w:r>
+        <w:rPr>
+          <w:lang w:val="en-US"/>
+        </w:rPr>
+        <w:t>side</w:t>
+      </w:r>
+      <w:r>
+        <w:rPr>
+          <w:lang w:val="en-US"/>
+        </w:rPr>
+        <w:t>-</w:t>
+      </w:r>
+      <w:r>
+        <w:rPr>
+          <w:lang w:val="en-US"/>
+        </w:rPr>
+        <w:t>by</w:t>
+      </w:r>
+      <w:r>
+        <w:rPr>
+          <w:lang w:val="en-US"/>
+        </w:rPr>
+        <w:t>-</w:t>
+      </w:r>
+      <w:r>
+        <w:rPr>
+          <w:lang w:val="en-US"/>
+        </w:rPr>
+        <w:t>side</w:t>
+      </w:r>
+      <w:r>
+        <w:rPr>
+          <w:lang w:val="en-US"/>
+        </w:rPr>
+        <w:t xml:space="preserve"> </w:t>
+      </w:r>
+      <w:r>
+        <w:t>με</w:t>
+      </w:r>
+      <w:r>
+        <w:rPr>
+          <w:lang w:val="en-US"/>
+        </w:rPr>
+        <w:t>:</w:t>
+      </w:r>
+    </w:p>
+    <w:p>
+      <w:pPr>
+        <w:rPr>
+          <w:lang w:val="en-US"/>
+        </w:rPr>
+      </w:pPr>
+      <w:r>
+        <w:rPr>
+          <w:lang w:val="en-US"/>
+        </w:rPr>
+        <w:t xml:space="preserve">  </w:t>
+      </w:r>
+      <w:r>
+        <w:rPr>
+          <w:lang w:val="en-US"/>
+        </w:rPr>
+        <w:t>- Reconstructed image preview</w:t>
+      </w:r>
+    </w:p>
+    <w:p>
+      <w:pPr>
+        <w:rPr>
+          <w:lang w:val="en-US"/>
+        </w:rPr>
+      </w:pPr>
+      <w:r>
+        <w:rPr>
+          <w:lang w:val="en-US"/>
+        </w:rPr>
+        <w:t xml:space="preserve">  - Position Accuracy: % tiles </w:t>
+      </w:r>
+      <w:proofErr w:type="spellStart"/>
+      <w:r>
+        <w:rPr>
+          <w:lang w:val="en-US"/>
+        </w:rPr>
+        <w:t>στη</w:t>
+      </w:r>
+      <w:proofErr w:type="spellEnd"/>
+      <w:r>
+        <w:rPr>
+          <w:lang w:val="en-US"/>
+        </w:rPr>
+        <w:t xml:space="preserve"> </w:t>
+      </w:r>
+      <w:proofErr w:type="spellStart"/>
+      <w:r>
+        <w:rPr>
+          <w:lang w:val="en-US"/>
+        </w:rPr>
+        <w:t>σωστή</w:t>
+      </w:r>
+      <w:proofErr w:type="spellEnd"/>
+      <w:r>
+        <w:rPr>
+          <w:lang w:val="en-US"/>
+        </w:rPr>
+        <w:t xml:space="preserve"> </w:t>
+      </w:r>
+      <w:proofErr w:type="spellStart"/>
+      <w:r>
+        <w:rPr>
+          <w:lang w:val="en-US"/>
+        </w:rPr>
+        <w:t>θέση</w:t>
+      </w:r>
+      <w:proofErr w:type="spellEnd"/>
+    </w:p>
+    <w:p>
+      <w:pPr>
+        <w:rPr>
+          <w:lang w:val="en-US"/>
+        </w:rPr>
+      </w:pPr>
+      <w:r>
+        <w:rPr>
+          <w:lang w:val="en-US"/>
+        </w:rPr>
+        <w:t xml:space="preserve">  - Rotation Accuracy: % tiles </w:t>
+      </w:r>
+      <w:proofErr w:type="spellStart"/>
+      <w:r>
+        <w:rPr>
+          <w:lang w:val="en-US"/>
+        </w:rPr>
+        <w:t>με</w:t>
+      </w:r>
+      <w:proofErr w:type="spellEnd"/>
+      <w:r>
+        <w:rPr>
+          <w:lang w:val="en-US"/>
+        </w:rPr>
+        <w:t xml:space="preserve"> </w:t>
+      </w:r>
+      <w:proofErr w:type="spellStart"/>
+      <w:r>
+        <w:rPr>
+          <w:lang w:val="en-US"/>
+        </w:rPr>
+        <w:t>σωστό</w:t>
+      </w:r>
+      <w:proofErr w:type="spellEnd"/>
+      <w:r>
+        <w:rPr>
+          <w:lang w:val="en-US"/>
+        </w:rPr>
+        <w:t xml:space="preserve"> rotation</w:t>
+      </w:r>
+    </w:p>
+    <w:p>
+      <w:pPr>
+        <w:rPr>
+          <w:lang w:val="en-US"/>
+        </w:rPr>
+      </w:pPr>
+      <w:r>
+        <w:rPr>
+          <w:lang w:val="en-US"/>
+        </w:rPr>
+        <w:t xml:space="preserve">  - Winner declaration (π</w:t>
+      </w:r>
+      <w:proofErr w:type="spellStart"/>
+      <w:r>
+        <w:rPr>
+          <w:lang w:val="en-US"/>
+        </w:rPr>
+        <w:t>οιος</w:t>
+      </w:r>
+      <w:proofErr w:type="spellEnd"/>
+      <w:r>
+        <w:rPr>
+          <w:lang w:val="en-US"/>
+        </w:rPr>
+        <w:t xml:space="preserve"> algorithm </w:t>
+      </w:r>
+      <w:proofErr w:type="spellStart"/>
+      <w:r>
+        <w:rPr>
+          <w:lang w:val="en-US"/>
+        </w:rPr>
+        <w:t>είχε</w:t>
+      </w:r>
+      <w:proofErr w:type="spellEnd"/>
+      <w:r>
+        <w:rPr>
+          <w:lang w:val="en-US"/>
+        </w:rPr>
+        <w:t xml:space="preserve"> κα</w:t>
+      </w:r>
+      <w:proofErr w:type="spellStart"/>
+      <w:r>
+        <w:rPr>
+          <w:lang w:val="en-US"/>
+        </w:rPr>
+        <w:t>λύτερο</w:t>
+      </w:r>
+      <w:proofErr w:type="spellEnd"/>
+      <w:r>
+        <w:rPr>
+          <w:lang w:val="en-US"/>
+        </w:rPr>
+        <w:t xml:space="preserve"> position accuracy)</w:t>
+      </w:r>
+    </w:p>
+    <w:p>
+      <w:pPr>
+        <w:rPr>
+          <w:lang w:val="en-US"/>
+        </w:rPr>
+      </w:pPr>
+    </w:p>
+    <w:p>
+      <w:pPr>
+        <w:rPr>
+          <w:lang w:val="en-US"/>
+        </w:rPr>
+      </w:pPr>
+      <w:r>
+        <w:rPr>
+          <w:lang w:val="en-US"/>
+        </w:rPr>
+        <w:t xml:space="preserve">  Accuracy Calculation:</w:t>
+      </w:r>
+    </w:p>
+    <w:p>
+      <w:pPr>
+        <w:rPr>
+          <w:lang w:val="en-US"/>
+        </w:rPr>
+      </w:pPr>
+      <w:r>
+        <w:rPr>
+          <w:lang w:val="en-US"/>
+        </w:rPr>
+        <w:t xml:space="preserve">  </w:t>
+      </w:r>
+      <w:r>
+        <w:t>Για</w:t>
+      </w:r>
+      <w:r>
+        <w:rPr>
+          <w:lang w:val="en-US"/>
+        </w:rPr>
+        <w:t xml:space="preserve"> </w:t>
+      </w:r>
+      <w:r>
         <w:t>κάθε</w:t>
       </w:r>
-      <w:proofErr w:type="spellEnd"/>
-      <w:r>
-        <w:rPr>
-          <w:lang w:val="en-US"/>
-        </w:rPr>
-        <w:t xml:space="preserve"> tile position (row, col):</w:t>
-      </w:r>
-    </w:p>
-    <w:p>
-      <w:pPr>
-        <w:rPr>
-          <w:lang w:val="en-US"/>
-        </w:rPr>
-      </w:pPr>
-      <w:r>
-        <w:rPr>
-          <w:lang w:val="en-US"/>
-        </w:rPr>
-        <w:t xml:space="preserve">  - Right neighbor compatibility:</w:t>
-      </w:r>
-    </w:p>
-    <w:p>
-      <w:pPr>
-        <w:rPr>
-          <w:lang w:val="en-US"/>
-        </w:rPr>
-      </w:pPr>
-      <w:r>
-        <w:rPr>
-          <w:lang w:val="en-US"/>
-        </w:rPr>
-        <w:t xml:space="preserve">    * matches = </w:t>
-      </w:r>
-      <w:proofErr w:type="gramStart"/>
-      <w:r>
-        <w:rPr>
-          <w:lang w:val="en-US"/>
-        </w:rPr>
-        <w:t>filter(</w:t>
-      </w:r>
-      <w:proofErr w:type="gramEnd"/>
-      <w:r>
-        <w:rPr>
-          <w:lang w:val="en-US"/>
-        </w:rPr>
-        <w:t xml:space="preserve">adjacency, </w:t>
-      </w:r>
-      <w:proofErr w:type="spellStart"/>
-      <w:r>
-        <w:rPr>
-          <w:lang w:val="en-US"/>
-        </w:rPr>
-        <w:t>tileA</w:t>
-      </w:r>
-      <w:proofErr w:type="spellEnd"/>
-      <w:r>
-        <w:rPr>
-          <w:lang w:val="en-US"/>
-        </w:rPr>
-        <w:t xml:space="preserve">=current, </w:t>
-      </w:r>
-      <w:proofErr w:type="spellStart"/>
-      <w:r>
-        <w:rPr>
-          <w:lang w:val="en-US"/>
-        </w:rPr>
-        <w:t>rotationA</w:t>
-      </w:r>
-      <w:proofErr w:type="spellEnd"/>
-      <w:r>
-        <w:rPr>
-          <w:lang w:val="en-US"/>
-        </w:rPr>
-        <w:t>=</w:t>
-      </w:r>
-      <w:proofErr w:type="spellStart"/>
-      <w:r>
-        <w:rPr>
-          <w:lang w:val="en-US"/>
-        </w:rPr>
-        <w:t>current.rotation</w:t>
-      </w:r>
-      <w:proofErr w:type="spellEnd"/>
+      <w:r>
+        <w:rPr>
+          <w:lang w:val="en-US"/>
+        </w:rPr>
+        <w:t xml:space="preserve"> </w:t>
+      </w:r>
+      <w:r>
+        <w:t>θέση</w:t>
+      </w:r>
+      <w:r>
+        <w:rPr>
+          <w:lang w:val="en-US"/>
+        </w:rPr>
+        <w:t xml:space="preserve"> (</w:t>
+      </w:r>
+      <w:r>
+        <w:rPr>
+          <w:lang w:val="en-US"/>
+        </w:rPr>
+        <w:t>row</w:t>
+      </w:r>
       <w:r>
         <w:rPr>
           <w:lang w:val="en-US"/>
         </w:rPr>
         <w:t xml:space="preserve">, </w:t>
       </w:r>
-      <w:proofErr w:type="spellStart"/>
-      <w:r>
-        <w:rPr>
-          <w:lang w:val="en-US"/>
-        </w:rPr>
-        <w:t>borderA</w:t>
-      </w:r>
-      <w:proofErr w:type="spellEnd"/>
-      <w:r>
-        <w:rPr>
-          <w:lang w:val="en-US"/>
-        </w:rPr>
-        <w:t>='right',</w:t>
-      </w:r>
-      <w:r>
-        <w:rPr>
-          <w:lang w:val="en-US"/>
-        </w:rPr>
-        <w:t xml:space="preserve"> </w:t>
-      </w:r>
-      <w:proofErr w:type="spellStart"/>
-      <w:r>
-        <w:rPr>
-          <w:lang w:val="en-US"/>
-        </w:rPr>
-        <w:t>tileB</w:t>
-      </w:r>
-      <w:proofErr w:type="spellEnd"/>
-      <w:r>
-        <w:rPr>
-          <w:lang w:val="en-US"/>
-        </w:rPr>
-        <w:t>=</w:t>
-      </w:r>
-      <w:proofErr w:type="spellStart"/>
-      <w:r>
-        <w:rPr>
-          <w:lang w:val="en-US"/>
-        </w:rPr>
-        <w:t>rightTile</w:t>
-      </w:r>
-      <w:proofErr w:type="spellEnd"/>
-      <w:r>
-        <w:rPr>
-          <w:lang w:val="en-US"/>
-        </w:rPr>
-        <w:t xml:space="preserve">, </w:t>
-      </w:r>
-      <w:proofErr w:type="spellStart"/>
-      <w:r>
-        <w:rPr>
-          <w:lang w:val="en-US"/>
-        </w:rPr>
-        <w:t>rotationB</w:t>
-      </w:r>
-      <w:proofErr w:type="spellEnd"/>
-      <w:r>
-        <w:rPr>
-          <w:lang w:val="en-US"/>
-        </w:rPr>
-        <w:t>=</w:t>
-      </w:r>
-      <w:proofErr w:type="spellStart"/>
-      <w:r>
-        <w:rPr>
-          <w:lang w:val="en-US"/>
-        </w:rPr>
-        <w:t>rightTile.rotation</w:t>
-      </w:r>
-      <w:proofErr w:type="spellEnd"/>
-      <w:r>
-        <w:rPr>
-          <w:lang w:val="en-US"/>
-        </w:rPr>
-        <w:t>)</w:t>
-      </w:r>
-    </w:p>
-    <w:p>
-      <w:pPr>
-        <w:rPr>
-          <w:lang w:val="en-US"/>
-        </w:rPr>
-      </w:pPr>
-      <w:r>
-        <w:rPr>
-          <w:lang w:val="en-US"/>
-        </w:rPr>
-        <w:t xml:space="preserve">    * </w:t>
-      </w:r>
-      <w:proofErr w:type="gramStart"/>
-      <w:r>
-        <w:rPr>
-          <w:lang w:val="en-US"/>
-        </w:rPr>
-        <w:t>energy</w:t>
-      </w:r>
-      <w:proofErr w:type="gramEnd"/>
-      <w:r>
-        <w:rPr>
-          <w:lang w:val="en-US"/>
-        </w:rPr>
-        <w:t xml:space="preserve"> -= </w:t>
-      </w:r>
-      <w:proofErr w:type="spellStart"/>
-      <w:r>
-        <w:rPr>
-          <w:lang w:val="en-US"/>
-        </w:rPr>
-        <w:t>bestMatch.compatibilityScore</w:t>
-      </w:r>
-      <w:proofErr w:type="spellEnd"/>
-    </w:p>
-    <w:p>
-      <w:pPr>
-        <w:rPr>
-          <w:lang w:val="en-US"/>
-        </w:rPr>
-      </w:pPr>
-      <w:r>
-        <w:rPr>
-          <w:lang w:val="en-US"/>
-        </w:rPr>
-        <w:t xml:space="preserve">  - Bottom neighbor compatibility:</w:t>
-      </w:r>
-    </w:p>
-    <w:p>
-      <w:pPr>
-        <w:rPr>
-          <w:lang w:val="en-US"/>
-        </w:rPr>
-      </w:pPr>
-      <w:r>
-        <w:rPr>
-          <w:lang w:val="en-US"/>
-        </w:rPr>
-        <w:t xml:space="preserve">    * Similar logic </w:t>
-      </w:r>
-      <w:proofErr w:type="spellStart"/>
-      <w:r>
-        <w:rPr>
-          <w:lang w:val="en-US"/>
-        </w:rPr>
-        <w:t>με</w:t>
-      </w:r>
-      <w:proofErr w:type="spellEnd"/>
-      <w:r>
-        <w:rPr>
-          <w:lang w:val="en-US"/>
-        </w:rPr>
-        <w:t xml:space="preserve"> </w:t>
-      </w:r>
-      <w:proofErr w:type="spellStart"/>
-      <w:r>
-        <w:rPr>
-          <w:lang w:val="en-US"/>
-        </w:rPr>
-        <w:t>borderA</w:t>
-      </w:r>
-      <w:proofErr w:type="spellEnd"/>
-      <w:r>
-        <w:rPr>
-          <w:lang w:val="en-US"/>
-        </w:rPr>
-        <w:t>='bottom'</w:t>
-      </w:r>
-    </w:p>
-    <w:p>
-      <w:pPr>
-        <w:rPr>
-          <w:lang w:val="en-US"/>
-        </w:rPr>
-      </w:pPr>
-    </w:p>
-    <w:p>
-      <w:pPr>
-        <w:rPr>
-          <w:lang w:val="en-US"/>
-        </w:rPr>
-      </w:pPr>
-      <w:r>
-        <w:rPr>
-          <w:lang w:val="en-US"/>
-        </w:rPr>
-        <w:t xml:space="preserve">  Total Energy = -</w:t>
-      </w:r>
-      <w:proofErr w:type="gramStart"/>
-      <w:r>
-        <w:rPr>
-          <w:lang w:val="en-US"/>
-        </w:rPr>
-        <w:t>Σ(</w:t>
-      </w:r>
-      <w:proofErr w:type="gramEnd"/>
-      <w:r>
-        <w:rPr>
-          <w:lang w:val="en-US"/>
-        </w:rPr>
-        <w:t>all neighbor compatibilities)</w:t>
-      </w:r>
-    </w:p>
-    <w:p>
-      <w:pPr>
-        <w:rPr>
-          <w:lang w:val="en-US"/>
-        </w:rPr>
-      </w:pPr>
-    </w:p>
-    <w:p>
-      <w:pPr>
-        <w:rPr>
-          <w:lang w:val="en-US"/>
-        </w:rPr>
-      </w:pPr>
-      <w:r>
-        <w:rPr>
-          <w:lang w:val="en-US"/>
-        </w:rPr>
-        <w:t xml:space="preserve">  Comparison Metrics:</w:t>
-      </w:r>
-    </w:p>
-    <w:p>
-      <w:r>
-        <w:t xml:space="preserve">  Και οι 2 </w:t>
-      </w:r>
-      <w:r>
-        <w:rPr>
-          <w:lang w:val="en-US"/>
-        </w:rPr>
-        <w:t>algorithms</w:t>
-      </w:r>
-      <w:r>
-        <w:t xml:space="preserve"> εμφανίζονται </w:t>
-      </w:r>
-      <w:r>
-        <w:rPr>
-          <w:lang w:val="en-US"/>
-        </w:rPr>
-        <w:t>side</w:t>
-      </w:r>
-      <w:r>
-        <w:t>-</w:t>
-      </w:r>
-      <w:r>
-        <w:rPr>
-          <w:lang w:val="en-US"/>
-        </w:rPr>
-        <w:t>by</w:t>
-      </w:r>
-      <w:r>
-        <w:t>-</w:t>
-      </w:r>
-      <w:r>
-        <w:rPr>
-          <w:lang w:val="en-US"/>
-        </w:rPr>
-        <w:t>side</w:t>
-      </w:r>
-      <w:r>
-        <w:t xml:space="preserve"> με:</w:t>
-      </w:r>
-    </w:p>
-    <w:p>
-      <w:pPr>
-        <w:rPr>
-          <w:lang w:val="en-US"/>
-        </w:rPr>
-      </w:pPr>
-      <w:r>
-        <w:t xml:space="preserve">  </w:t>
-      </w:r>
-      <w:r>
-        <w:rPr>
-          <w:lang w:val="en-US"/>
-        </w:rPr>
-        <w:t>- Reconstructed image preview</w:t>
-      </w:r>
-    </w:p>
-    <w:p>
-      <w:pPr>
-        <w:rPr>
-          <w:lang w:val="en-US"/>
-        </w:rPr>
-      </w:pPr>
-      <w:r>
-        <w:rPr>
-          <w:lang w:val="en-US"/>
-        </w:rPr>
-        <w:t xml:space="preserve">  - Position Accuracy: % tiles </w:t>
-      </w:r>
-      <w:proofErr w:type="spellStart"/>
-      <w:r>
-        <w:rPr>
-          <w:lang w:val="en-US"/>
-        </w:rPr>
-        <w:t>στη</w:t>
-      </w:r>
-      <w:proofErr w:type="spellEnd"/>
-      <w:r>
-        <w:rPr>
-          <w:lang w:val="en-US"/>
-        </w:rPr>
-        <w:t xml:space="preserve"> </w:t>
-      </w:r>
-      <w:proofErr w:type="spellStart"/>
-      <w:r>
-        <w:rPr>
-          <w:lang w:val="en-US"/>
-        </w:rPr>
-        <w:t>σωστή</w:t>
-      </w:r>
-      <w:proofErr w:type="spellEnd"/>
-      <w:r>
-        <w:rPr>
-          <w:lang w:val="en-US"/>
-        </w:rPr>
-        <w:t xml:space="preserve"> </w:t>
-      </w:r>
-      <w:proofErr w:type="spellStart"/>
-      <w:r>
-        <w:rPr>
-          <w:lang w:val="en-US"/>
-        </w:rPr>
-        <w:t>θέση</w:t>
-      </w:r>
-      <w:proofErr w:type="spellEnd"/>
-    </w:p>
-    <w:p>
-      <w:pPr>
-        <w:rPr>
-          <w:lang w:val="en-US"/>
-        </w:rPr>
-      </w:pPr>
-      <w:r>
-        <w:rPr>
-          <w:lang w:val="en-US"/>
-        </w:rPr>
-        <w:t xml:space="preserve">  - Rotation Accuracy: % tiles </w:t>
-      </w:r>
-      <w:proofErr w:type="spellStart"/>
-      <w:r>
-        <w:rPr>
-          <w:lang w:val="en-US"/>
-        </w:rPr>
-        <w:t>με</w:t>
-      </w:r>
-      <w:proofErr w:type="spellEnd"/>
-      <w:r>
-        <w:rPr>
-          <w:lang w:val="en-US"/>
-        </w:rPr>
-        <w:t xml:space="preserve"> </w:t>
-      </w:r>
-      <w:proofErr w:type="spellStart"/>
-      <w:r>
-        <w:rPr>
-          <w:lang w:val="en-US"/>
-        </w:rPr>
-        <w:t>σωστό</w:t>
-      </w:r>
-      <w:proofErr w:type="spellEnd"/>
-      <w:r>
-        <w:rPr>
-          <w:lang w:val="en-US"/>
-        </w:rPr>
-        <w:t xml:space="preserve"> rotation</w:t>
-      </w:r>
-    </w:p>
-    <w:p>
-      <w:pPr>
-        <w:rPr>
-          <w:lang w:val="en-US"/>
-        </w:rPr>
-      </w:pPr>
-      <w:r>
-        <w:rPr>
-          <w:lang w:val="en-US"/>
-        </w:rPr>
-        <w:t xml:space="preserve">  - Winner declaration (π</w:t>
-      </w:r>
-      <w:proofErr w:type="spellStart"/>
-      <w:r>
-        <w:rPr>
-          <w:lang w:val="en-US"/>
-        </w:rPr>
-        <w:t>οιος</w:t>
-      </w:r>
-      <w:proofErr w:type="spellEnd"/>
-      <w:r>
-        <w:rPr>
-          <w:lang w:val="en-US"/>
-        </w:rPr>
-        <w:t xml:space="preserve"> algorithm </w:t>
-      </w:r>
-      <w:proofErr w:type="spellStart"/>
-      <w:r>
-        <w:rPr>
-          <w:lang w:val="en-US"/>
-        </w:rPr>
-        <w:t>είχε</w:t>
-      </w:r>
-      <w:proofErr w:type="spellEnd"/>
-      <w:r>
-        <w:rPr>
-          <w:lang w:val="en-US"/>
-        </w:rPr>
-        <w:t xml:space="preserve"> κα</w:t>
-      </w:r>
-      <w:proofErr w:type="spellStart"/>
-      <w:r>
-        <w:rPr>
-          <w:lang w:val="en-US"/>
-        </w:rPr>
-        <w:t>λύτερο</w:t>
-      </w:r>
-      <w:proofErr w:type="spellEnd"/>
-      <w:r>
-        <w:rPr>
-          <w:lang w:val="en-US"/>
-        </w:rPr>
-        <w:t xml:space="preserve"> position accuracy)</w:t>
-      </w:r>
-    </w:p>
-    <w:p>
-      <w:pPr>
-        <w:rPr>
-          <w:lang w:val="en-US"/>
-        </w:rPr>
-      </w:pPr>
-    </w:p>
-    <w:p>
-      <w:pPr>
-        <w:rPr>
-          <w:lang w:val="en-US"/>
-        </w:rPr>
-      </w:pPr>
-      <w:r>
-        <w:rPr>
-          <w:lang w:val="en-US"/>
-        </w:rPr>
-        <w:t xml:space="preserve">  Accuracy Calculation:</w:t>
-      </w:r>
-    </w:p>
-    <w:p>
-      <w:r>
-        <w:t xml:space="preserve">  Για κάθε θέση (</w:t>
-      </w:r>
-      <w:r>
-        <w:rPr>
-          <w:lang w:val="en-US"/>
-        </w:rPr>
-        <w:t>row</w:t>
-      </w:r>
-      <w:r>
-        <w:t xml:space="preserve">, </w:t>
-      </w:r>
       <w:r>
         <w:rPr>
           <w:lang w:val="en-US"/>
@@ -9832,6 +10070,9 @@
         <w:t>col</w:t>
       </w:r>
       <w:r>
+        <w:rPr>
+          <w:lang w:val="en-US"/>
+        </w:rPr>
         <w:t>):</w:t>
       </w:r>
     </w:p>
@@ -9842,6 +10083,9 @@
         </w:rPr>
       </w:pPr>
       <w:r>
+        <w:rPr>
+          <w:lang w:val="en-US"/>
+        </w:rPr>
         <w:lastRenderedPageBreak/>
         <w:t xml:space="preserve">  </w:t>
       </w:r>
@@ -9900,19 +10144,7 @@
         <w:rPr>
           <w:lang w:val="en-US"/>
         </w:rPr>
-        <w:t xml:space="preserve">  2. Correct source index = row </w:t>
-      </w:r>
-      <w:r>
-        <w:rPr>
-          <w:lang w:val="en-US"/>
-        </w:rPr>
-        <w:t>*</w:t>
-      </w:r>
-      <w:r>
-        <w:rPr>
-          <w:lang w:val="en-US"/>
-        </w:rPr>
-        <w:t xml:space="preserve"> </w:t>
+        <w:t xml:space="preserve">  2. Correct source index = row * </w:t>
       </w:r>
       <w:proofErr w:type="spellStart"/>
       <w:r>
@@ -10325,6 +10557,11 @@
       </w:r>
     </w:p>
     <w:p>
+      <w:pPr>
+        <w:rPr>
+          <w:lang w:val="en-US"/>
+        </w:rPr>
+      </w:pPr>
       <w:r>
         <w:rPr>
           <w:lang w:val="en-US"/>
@@ -10359,22 +10596,16 @@
         <w:rPr>
           <w:lang w:val="en-US"/>
         </w:rPr>
-        <w:t xml:space="preserve"> </w:t>
-      </w:r>
-      <w:r>
-        <w:rPr>
-          <w:lang w:val="en-US"/>
-        </w:rPr>
-        <w:t>*</w:t>
-      </w:r>
-      <w:r>
-        <w:rPr>
-          <w:lang w:val="en-US"/>
-        </w:rPr>
-        <w:t xml:space="preserve"> π) / 180</w:t>
-      </w:r>
-    </w:p>
-    <w:p/>
+        <w:t xml:space="preserve"> * π) / 180</w:t>
+      </w:r>
+    </w:p>
+    <w:p>
+      <w:pPr>
+        <w:rPr>
+          <w:lang w:val="en-US"/>
+        </w:rPr>
+      </w:pPr>
+    </w:p>
     <w:p>
       <w:pPr>
         <w:jc w:val="center"/>
@@ -10384,6 +10615,7 @@
           <w:sz w:val="40"/>
           <w:szCs w:val="40"/>
           <w:u w:val="single"/>
+          <w:lang w:val="en-US"/>
         </w:rPr>
       </w:pPr>
       <w:r>
@@ -10393,32 +10625,39 @@
           <w:sz w:val="40"/>
           <w:szCs w:val="40"/>
           <w:u w:val="single"/>
+          <w:lang w:val="en-US"/>
         </w:rPr>
         <w:t>FRONTEND COMPONENTS</w:t>
       </w:r>
     </w:p>
-    <w:p/>
-    <w:p>
-      <w:pPr>
-        <w:rPr>
-          <w:color w:val="000000" w:themeColor="text1"/>
-          <w:lang w:val="en-US"/>
-        </w:rPr>
-      </w:pPr>
-      <w:r>
-        <w:rPr>
-          <w:color w:val="000000" w:themeColor="text1"/>
-          <w:lang w:val="en-US"/>
-        </w:rPr>
-        <w:t>1. U</w:t>
-      </w:r>
-      <w:proofErr w:type="spellStart"/>
-      <w:r>
-        <w:rPr>
-          <w:color w:val="000000" w:themeColor="text1"/>
-          <w:lang w:val="en-US"/>
-        </w:rPr>
-        <w:t>ploadImage.jsx</w:t>
+    <w:p>
+      <w:pPr>
+        <w:rPr>
+          <w:lang w:val="en-US"/>
+        </w:rPr>
+      </w:pPr>
+    </w:p>
+    <w:p>
+      <w:pPr>
+        <w:rPr>
+          <w:color w:val="000000" w:themeColor="text1"/>
+          <w:lang w:val="en-US"/>
+        </w:rPr>
+      </w:pPr>
+      <w:r>
+        <w:rPr>
+          <w:color w:val="000000" w:themeColor="text1"/>
+          <w:lang w:val="en-US"/>
+        </w:rPr>
+        <w:t xml:space="preserve">1. </w:t>
+      </w:r>
+      <w:proofErr w:type="spellStart"/>
+      <w:r>
+        <w:rPr>
+          <w:color w:val="000000" w:themeColor="text1"/>
+          <w:lang w:val="en-US"/>
+        </w:rPr>
+        <w:t>UploadImage.jsx</w:t>
       </w:r>
       <w:proofErr w:type="spellEnd"/>
     </w:p>
@@ -10520,6 +10759,7 @@
       <w:pPr>
         <w:rPr>
           <w:color w:val="000000" w:themeColor="text1"/>
+          <w:lang w:val="en-US"/>
         </w:rPr>
       </w:pPr>
       <w:r>
@@ -10566,7 +10806,7 @@
           <w:color w:val="000000" w:themeColor="text1"/>
           <w:lang w:val="en-US"/>
         </w:rPr>
-        <w:t xml:space="preserve">     - Grid size selection (2</w:t>
+        <w:t xml:space="preserve">     - Grid size selection (2*2, 3</w:t>
       </w:r>
       <w:r>
         <w:rPr>
@@ -10580,11 +10820,12 @@
           <w:color w:val="000000" w:themeColor="text1"/>
           <w:lang w:val="en-US"/>
         </w:rPr>
-        <w:t>2, 3</w:t>
-      </w:r>
-      <w:r>
-        <w:rPr>
-          <w:color w:val="000000" w:themeColor="text1"/>
+        <w:t>3, 4</w:t>
+      </w:r>
+      <w:r>
+        <w:rPr>
+          <w:color w:val="000000" w:themeColor="text1"/>
+          <w:lang w:val="en-US"/>
         </w:rPr>
         <w:t>*</w:t>
       </w:r>
@@ -10593,20 +10834,23 @@
           <w:color w:val="000000" w:themeColor="text1"/>
           <w:lang w:val="en-US"/>
         </w:rPr>
-        <w:t>3, 4</w:t>
-      </w:r>
-      <w:r>
-        <w:rPr>
-          <w:color w:val="000000" w:themeColor="text1"/>
-        </w:rPr>
-        <w:t>*</w:t>
-      </w:r>
-      <w:r>
-        <w:rPr>
-          <w:color w:val="000000" w:themeColor="text1"/>
-          <w:lang w:val="en-US"/>
-        </w:rPr>
-        <w:t>4, κλπ)</w:t>
+        <w:t xml:space="preserve">4, </w:t>
+      </w:r>
+      <w:proofErr w:type="spellStart"/>
+      <w:r>
+        <w:rPr>
+          <w:color w:val="000000" w:themeColor="text1"/>
+          <w:lang w:val="en-US"/>
+        </w:rPr>
+        <w:t>κλ</w:t>
+      </w:r>
+      <w:proofErr w:type="spellEnd"/>
+      <w:r>
+        <w:rPr>
+          <w:color w:val="000000" w:themeColor="text1"/>
+          <w:lang w:val="en-US"/>
+        </w:rPr>
+        <w:t>π)</w:t>
       </w:r>
     </w:p>
     <w:p>
@@ -10644,6 +10888,7 @@
       <w:pPr>
         <w:rPr>
           <w:color w:val="000000" w:themeColor="text1"/>
+          <w:lang w:val="en-US"/>
         </w:rPr>
       </w:pPr>
       <w:r>
@@ -10854,6 +11099,7 @@
       <w:pPr>
         <w:rPr>
           <w:color w:val="000000" w:themeColor="text1"/>
+          <w:lang w:val="en-US"/>
         </w:rPr>
       </w:pPr>
       <w:r>
@@ -11134,6 +11380,7 @@
       <w:pPr>
         <w:rPr>
           <w:color w:val="000000" w:themeColor="text1"/>
+          <w:lang w:val="en-US"/>
         </w:rPr>
       </w:pPr>
       <w:r>
@@ -11371,6 +11618,7 @@
       <w:pPr>
         <w:rPr>
           <w:color w:val="000000" w:themeColor="text1"/>
+          <w:lang w:val="en-US"/>
         </w:rPr>
       </w:pPr>
       <w:r>
@@ -11622,6 +11870,7 @@
       <w:pPr>
         <w:rPr>
           <w:color w:val="000000" w:themeColor="text1"/>
+          <w:lang w:val="en-US"/>
         </w:rPr>
       </w:pPr>
       <w:r>
@@ -12005,9 +12254,15 @@
       <w:r>
         <w:rPr>
           <w:color w:val="000000" w:themeColor="text1"/>
-          <w:lang w:val="en-US"/>
-        </w:rPr>
-        <w:t xml:space="preserve">  8. </w:t>
+        </w:rPr>
+        <w:t xml:space="preserve">  </w:t>
+      </w:r>
+      <w:r>
+        <w:rPr>
+          <w:color w:val="000000" w:themeColor="text1"/>
+          <w:lang w:val="en-US"/>
+        </w:rPr>
+        <w:t xml:space="preserve">8. </w:t>
       </w:r>
       <w:proofErr w:type="spellStart"/>
       <w:r>
@@ -12030,6 +12285,7 @@
       <w:pPr>
         <w:rPr>
           <w:color w:val="000000" w:themeColor="text1"/>
+          <w:lang w:val="en-US"/>
         </w:rPr>
       </w:pPr>
       <w:r>
@@ -12239,6 +12495,7 @@
       <w:pPr>
         <w:rPr>
           <w:color w:val="000000" w:themeColor="text1"/>
+          <w:lang w:val="en-US"/>
         </w:rPr>
       </w:pPr>
       <w:r>
@@ -12254,19 +12511,21 @@
       <w:pPr>
         <w:rPr>
           <w:color w:val="000000" w:themeColor="text1"/>
-        </w:rPr>
-      </w:pPr>
-    </w:p>
-    <w:p>
-      <w:pPr>
-        <w:rPr>
-          <w:color w:val="000000" w:themeColor="text1"/>
-          <w:lang w:val="en-US"/>
-        </w:rPr>
-      </w:pPr>
-      <w:r>
-        <w:rPr>
-          <w:color w:val="000000" w:themeColor="text1"/>
+          <w:lang w:val="en-US"/>
+        </w:rPr>
+      </w:pPr>
+    </w:p>
+    <w:p>
+      <w:pPr>
+        <w:rPr>
+          <w:color w:val="000000" w:themeColor="text1"/>
+          <w:lang w:val="en-US"/>
+        </w:rPr>
+      </w:pPr>
+      <w:r>
+        <w:rPr>
+          <w:color w:val="000000" w:themeColor="text1"/>
+          <w:lang w:val="en-US"/>
         </w:rPr>
         <w:t xml:space="preserve">     </w:t>
       </w:r>
@@ -12433,6 +12692,7 @@
           <w:sz w:val="40"/>
           <w:szCs w:val="40"/>
           <w:u w:val="single"/>
+          <w:lang w:val="en-US"/>
         </w:rPr>
       </w:pPr>
       <w:r>
@@ -12484,6 +12744,7 @@
           <w:sz w:val="40"/>
           <w:szCs w:val="40"/>
           <w:u w:val="single"/>
+          <w:lang w:val="en-US"/>
         </w:rPr>
       </w:pPr>
     </w:p>
@@ -14101,28 +14362,57 @@
       <w:pPr>
         <w:rPr>
           <w:color w:val="000000" w:themeColor="text1"/>
-          <w:lang w:val="en-US"/>
-        </w:rPr>
-      </w:pPr>
-      <w:r>
-        <w:rPr>
-          <w:color w:val="000000" w:themeColor="text1"/>
-          <w:lang w:val="en-US"/>
-        </w:rPr>
-        <w:t xml:space="preserve">              "left": [...5 layers...]</w:t>
-      </w:r>
-    </w:p>
-    <w:p>
-      <w:pPr>
-        <w:rPr>
-          <w:color w:val="000000" w:themeColor="text1"/>
-          <w:lang w:val="en-US"/>
-        </w:rPr>
-      </w:pPr>
-      <w:r>
-        <w:rPr>
-          <w:color w:val="000000" w:themeColor="text1"/>
-          <w:lang w:val="en-US"/>
+        </w:rPr>
+      </w:pPr>
+      <w:r>
+        <w:rPr>
+          <w:color w:val="000000" w:themeColor="text1"/>
+          <w:lang w:val="en-US"/>
+        </w:rPr>
+        <w:t xml:space="preserve">              </w:t>
+      </w:r>
+      <w:r>
+        <w:rPr>
+          <w:color w:val="000000" w:themeColor="text1"/>
+        </w:rPr>
+        <w:t>"</w:t>
+      </w:r>
+      <w:r>
+        <w:rPr>
+          <w:color w:val="000000" w:themeColor="text1"/>
+          <w:lang w:val="en-US"/>
+        </w:rPr>
+        <w:t>left</w:t>
+      </w:r>
+      <w:r>
+        <w:rPr>
+          <w:color w:val="000000" w:themeColor="text1"/>
+        </w:rPr>
+        <w:t xml:space="preserve">": [...5 </w:t>
+      </w:r>
+      <w:r>
+        <w:rPr>
+          <w:color w:val="000000" w:themeColor="text1"/>
+          <w:lang w:val="en-US"/>
+        </w:rPr>
+        <w:t>layers</w:t>
+      </w:r>
+      <w:r>
+        <w:rPr>
+          <w:color w:val="000000" w:themeColor="text1"/>
+        </w:rPr>
+        <w:t>...]</w:t>
+      </w:r>
+    </w:p>
+    <w:p>
+      <w:pPr>
+        <w:rPr>
+          <w:color w:val="000000" w:themeColor="text1"/>
+        </w:rPr>
+      </w:pPr>
+      <w:r>
+        <w:rPr>
+          <w:color w:val="000000" w:themeColor="text1"/>
         </w:rPr>
         <w:t xml:space="preserve">            }</w:t>
       </w:r>
@@ -14136,7 +14426,6 @@
       <w:r>
         <w:rPr>
           <w:color w:val="000000" w:themeColor="text1"/>
-          <w:lang w:val="en-US"/>
         </w:rPr>
         <w:t xml:space="preserve">          </w:t>
       </w:r>
@@ -14190,7 +14479,6 @@
       <w:pPr>
         <w:rPr>
           <w:color w:val="000000" w:themeColor="text1"/>
-          <w:lang w:val="en-US"/>
         </w:rPr>
       </w:pPr>
       <w:r>
@@ -14202,7 +14490,6 @@
       <w:r>
         <w:rPr>
           <w:color w:val="000000" w:themeColor="text1"/>
-          <w:lang w:val="en-US"/>
         </w:rPr>
         <w:t>}</w:t>
       </w:r>
@@ -14211,13 +14498,11 @@
       <w:pPr>
         <w:rPr>
           <w:color w:val="000000" w:themeColor="text1"/>
-          <w:lang w:val="en-US"/>
-        </w:rPr>
-      </w:pPr>
-      <w:r>
-        <w:rPr>
-          <w:color w:val="000000" w:themeColor="text1"/>
-          <w:lang w:val="en-US"/>
+        </w:rPr>
+      </w:pPr>
+      <w:r>
+        <w:rPr>
+          <w:color w:val="000000" w:themeColor="text1"/>
         </w:rPr>
         <w:t xml:space="preserve">      },</w:t>
       </w:r>
@@ -14226,60 +14511,31 @@
       <w:pPr>
         <w:rPr>
           <w:color w:val="000000" w:themeColor="text1"/>
-          <w:lang w:val="en-US"/>
-        </w:rPr>
-      </w:pPr>
-      <w:r>
-        <w:rPr>
-          <w:color w:val="000000" w:themeColor="text1"/>
-          <w:lang w:val="en-US"/>
-        </w:rPr>
-        <w:t xml:space="preserve">      ...</w:t>
-      </w:r>
-      <w:proofErr w:type="spellStart"/>
-      <w:r>
-        <w:rPr>
-          <w:color w:val="000000" w:themeColor="text1"/>
-          <w:lang w:val="en-US"/>
-        </w:rPr>
-        <w:t>γι</w:t>
-      </w:r>
-      <w:proofErr w:type="spellEnd"/>
-      <w:r>
-        <w:rPr>
-          <w:color w:val="000000" w:themeColor="text1"/>
-          <w:lang w:val="en-US"/>
-        </w:rPr>
-        <w:t xml:space="preserve">α </w:t>
-      </w:r>
-      <w:proofErr w:type="spellStart"/>
-      <w:r>
-        <w:rPr>
-          <w:color w:val="000000" w:themeColor="text1"/>
-          <w:lang w:val="en-US"/>
-        </w:rPr>
-        <w:t>κάθε</w:t>
-      </w:r>
-      <w:proofErr w:type="spellEnd"/>
-      <w:r>
-        <w:rPr>
-          <w:color w:val="000000" w:themeColor="text1"/>
-          <w:lang w:val="en-US"/>
-        </w:rPr>
-        <w:t xml:space="preserve"> tile</w:t>
-      </w:r>
-    </w:p>
-    <w:p>
-      <w:pPr>
-        <w:rPr>
-          <w:color w:val="000000" w:themeColor="text1"/>
-          <w:lang w:val="en-US"/>
-        </w:rPr>
-      </w:pPr>
-      <w:r>
-        <w:rPr>
-          <w:color w:val="000000" w:themeColor="text1"/>
-          <w:lang w:val="en-US"/>
+        </w:rPr>
+      </w:pPr>
+      <w:r>
+        <w:rPr>
+          <w:color w:val="000000" w:themeColor="text1"/>
+        </w:rPr>
+        <w:t xml:space="preserve">      ...για κάθε </w:t>
+      </w:r>
+      <w:r>
+        <w:rPr>
+          <w:color w:val="000000" w:themeColor="text1"/>
+          <w:lang w:val="en-US"/>
+        </w:rPr>
+        <w:t>tile</w:t>
+      </w:r>
+    </w:p>
+    <w:p>
+      <w:pPr>
+        <w:rPr>
+          <w:color w:val="000000" w:themeColor="text1"/>
+        </w:rPr>
+      </w:pPr>
+      <w:r>
+        <w:rPr>
+          <w:color w:val="000000" w:themeColor="text1"/>
         </w:rPr>
         <w:t xml:space="preserve">    ]</w:t>
       </w:r>
@@ -14294,43 +14550,53 @@
       <w:r>
         <w:rPr>
           <w:color w:val="000000" w:themeColor="text1"/>
-          <w:lang w:val="en-US"/>
-        </w:rPr>
-        <w:t xml:space="preserve">  }</w:t>
-      </w:r>
-    </w:p>
-    <w:p>
-      <w:pPr>
-        <w:rPr>
-          <w:color w:val="000000" w:themeColor="text1"/>
-        </w:rPr>
-      </w:pPr>
-      <w:r>
-        <w:rPr>
-          <w:color w:val="000000" w:themeColor="text1"/>
-          <w:lang w:val="en-US"/>
         </w:rPr>
         <w:t xml:space="preserve">  </w:t>
       </w:r>
-    </w:p>
-    <w:p>
-      <w:pPr>
-        <w:rPr>
-          <w:color w:val="000000" w:themeColor="text1"/>
-        </w:rPr>
-      </w:pPr>
-    </w:p>
-    <w:p>
-      <w:pPr>
-        <w:rPr>
-          <w:color w:val="000000" w:themeColor="text1"/>
-        </w:rPr>
-      </w:pPr>
-    </w:p>
-    <w:p>
-      <w:pPr>
-        <w:rPr>
-          <w:color w:val="000000" w:themeColor="text1"/>
+      <w:r>
+        <w:rPr>
+          <w:color w:val="000000" w:themeColor="text1"/>
+          <w:lang w:val="en-US"/>
+        </w:rPr>
+        <w:t>}</w:t>
+      </w:r>
+    </w:p>
+    <w:p>
+      <w:pPr>
+        <w:rPr>
+          <w:color w:val="000000" w:themeColor="text1"/>
+          <w:lang w:val="en-US"/>
+        </w:rPr>
+      </w:pPr>
+      <w:r>
+        <w:rPr>
+          <w:color w:val="000000" w:themeColor="text1"/>
+          <w:lang w:val="en-US"/>
+        </w:rPr>
+        <w:t xml:space="preserve">  </w:t>
+      </w:r>
+    </w:p>
+    <w:p>
+      <w:pPr>
+        <w:rPr>
+          <w:color w:val="000000" w:themeColor="text1"/>
+          <w:lang w:val="en-US"/>
+        </w:rPr>
+      </w:pPr>
+    </w:p>
+    <w:p>
+      <w:pPr>
+        <w:rPr>
+          <w:color w:val="000000" w:themeColor="text1"/>
+          <w:lang w:val="en-US"/>
+        </w:rPr>
+      </w:pPr>
+    </w:p>
+    <w:p>
+      <w:pPr>
+        <w:rPr>
+          <w:color w:val="000000" w:themeColor="text1"/>
+          <w:lang w:val="en-US"/>
         </w:rPr>
       </w:pPr>
     </w:p>
@@ -15781,48 +16047,55 @@
       <w:pPr>
         <w:rPr>
           <w:color w:val="000000" w:themeColor="text1"/>
-        </w:rPr>
-      </w:pPr>
-    </w:p>
-    <w:p>
-      <w:pPr>
-        <w:rPr>
-          <w:color w:val="000000" w:themeColor="text1"/>
-        </w:rPr>
-      </w:pPr>
-    </w:p>
-    <w:p>
-      <w:pPr>
-        <w:rPr>
-          <w:color w:val="000000" w:themeColor="text1"/>
-        </w:rPr>
-      </w:pPr>
-    </w:p>
-    <w:p>
-      <w:pPr>
-        <w:rPr>
-          <w:color w:val="000000" w:themeColor="text1"/>
-        </w:rPr>
-      </w:pPr>
-    </w:p>
-    <w:p>
-      <w:pPr>
-        <w:rPr>
-          <w:color w:val="000000" w:themeColor="text1"/>
-        </w:rPr>
-      </w:pPr>
-    </w:p>
-    <w:p>
-      <w:pPr>
-        <w:rPr>
-          <w:color w:val="000000" w:themeColor="text1"/>
-        </w:rPr>
-      </w:pPr>
-    </w:p>
-    <w:p>
-      <w:pPr>
-        <w:rPr>
-          <w:color w:val="000000" w:themeColor="text1"/>
+          <w:lang w:val="en-US"/>
+        </w:rPr>
+      </w:pPr>
+    </w:p>
+    <w:p>
+      <w:pPr>
+        <w:rPr>
+          <w:color w:val="000000" w:themeColor="text1"/>
+          <w:lang w:val="en-US"/>
+        </w:rPr>
+      </w:pPr>
+    </w:p>
+    <w:p>
+      <w:pPr>
+        <w:rPr>
+          <w:color w:val="000000" w:themeColor="text1"/>
+          <w:lang w:val="en-US"/>
+        </w:rPr>
+      </w:pPr>
+    </w:p>
+    <w:p>
+      <w:pPr>
+        <w:rPr>
+          <w:color w:val="000000" w:themeColor="text1"/>
+          <w:lang w:val="en-US"/>
+        </w:rPr>
+      </w:pPr>
+    </w:p>
+    <w:p>
+      <w:pPr>
+        <w:rPr>
+          <w:color w:val="000000" w:themeColor="text1"/>
+          <w:lang w:val="en-US"/>
+        </w:rPr>
+      </w:pPr>
+    </w:p>
+    <w:p>
+      <w:pPr>
+        <w:rPr>
+          <w:color w:val="000000" w:themeColor="text1"/>
+          <w:lang w:val="en-US"/>
+        </w:rPr>
+      </w:pPr>
+    </w:p>
+    <w:p>
+      <w:pPr>
+        <w:rPr>
+          <w:color w:val="000000" w:themeColor="text1"/>
+          <w:lang w:val="en-US"/>
         </w:rPr>
       </w:pPr>
     </w:p>
@@ -16311,6 +16584,7 @@
       <w:pPr>
         <w:rPr>
           <w:color w:val="000000" w:themeColor="text1"/>
+          <w:lang w:val="en-US"/>
         </w:rPr>
       </w:pPr>
       <w:r>
@@ -16616,6 +16890,7 @@
           <w:sz w:val="40"/>
           <w:szCs w:val="40"/>
           <w:u w:val="single"/>
+          <w:lang w:val="en-US"/>
         </w:rPr>
       </w:pPr>
     </w:p>
@@ -16728,6 +17003,7 @@
       <w:pPr>
         <w:rPr>
           <w:color w:val="000000" w:themeColor="text1"/>
+          <w:lang w:val="en-US"/>
         </w:rPr>
       </w:pPr>
       <w:r>
@@ -16740,6 +17016,7 @@
       <w:r>
         <w:rPr>
           <w:color w:val="000000" w:themeColor="text1"/>
+          <w:lang w:val="en-US"/>
         </w:rPr>
         <w:t xml:space="preserve">2. </w:t>
       </w:r>
@@ -16753,6 +17030,7 @@
       <w:r>
         <w:rPr>
           <w:color w:val="000000" w:themeColor="text1"/>
+          <w:lang w:val="en-US"/>
         </w:rPr>
         <w:t xml:space="preserve"> -</w:t>
       </w:r>
@@ -16766,6 +17044,7 @@
       <w:r>
         <w:rPr>
           <w:color w:val="000000" w:themeColor="text1"/>
+          <w:lang w:val="en-US"/>
         </w:rPr>
         <w:t xml:space="preserve"> </w:t>
       </w:r>
@@ -16781,6 +17060,7 @@
       <w:r>
         <w:rPr>
           <w:color w:val="000000" w:themeColor="text1"/>
+          <w:lang w:val="en-US"/>
         </w:rPr>
         <w:t xml:space="preserve"> </w:t>
       </w:r>
@@ -16796,20 +17076,61 @@
       <w:r>
         <w:rPr>
           <w:color w:val="000000" w:themeColor="text1"/>
-        </w:rPr>
-        <w:t xml:space="preserve"> (αν δεν υπάρχει)</w:t>
-      </w:r>
-    </w:p>
-    <w:p>
-      <w:pPr>
-        <w:rPr>
-          <w:color w:val="000000" w:themeColor="text1"/>
-          <w:lang w:val="en-US"/>
-        </w:rPr>
-      </w:pPr>
-      <w:r>
-        <w:rPr>
-          <w:color w:val="000000" w:themeColor="text1"/>
+          <w:lang w:val="en-US"/>
+        </w:rPr>
+        <w:t xml:space="preserve"> (</w:t>
+      </w:r>
+      <w:r>
+        <w:rPr>
+          <w:color w:val="000000" w:themeColor="text1"/>
+        </w:rPr>
+        <w:t>αν</w:t>
+      </w:r>
+      <w:r>
+        <w:rPr>
+          <w:color w:val="000000" w:themeColor="text1"/>
+          <w:lang w:val="en-US"/>
+        </w:rPr>
+        <w:t xml:space="preserve"> </w:t>
+      </w:r>
+      <w:r>
+        <w:rPr>
+          <w:color w:val="000000" w:themeColor="text1"/>
+        </w:rPr>
+        <w:t>δεν</w:t>
+      </w:r>
+      <w:r>
+        <w:rPr>
+          <w:color w:val="000000" w:themeColor="text1"/>
+          <w:lang w:val="en-US"/>
+        </w:rPr>
+        <w:t xml:space="preserve"> </w:t>
+      </w:r>
+      <w:r>
+        <w:rPr>
+          <w:color w:val="000000" w:themeColor="text1"/>
+        </w:rPr>
+        <w:t>υπάρχει</w:t>
+      </w:r>
+      <w:r>
+        <w:rPr>
+          <w:color w:val="000000" w:themeColor="text1"/>
+          <w:lang w:val="en-US"/>
+        </w:rPr>
+        <w:t>)</w:t>
+      </w:r>
+    </w:p>
+    <w:p>
+      <w:pPr>
+        <w:rPr>
+          <w:color w:val="000000" w:themeColor="text1"/>
+          <w:lang w:val="en-US"/>
+        </w:rPr>
+      </w:pPr>
+      <w:r>
+        <w:rPr>
+          <w:color w:val="000000" w:themeColor="text1"/>
+          <w:lang w:val="en-US"/>
         </w:rPr>
         <w:t xml:space="preserve">  </w:t>
       </w:r>
@@ -16944,6 +17265,7 @@
       <w:r>
         <w:rPr>
           <w:color w:val="000000" w:themeColor="text1"/>
+          <w:lang w:val="en-US"/>
         </w:rPr>
         <w:t xml:space="preserve">  </w:t>
       </w:r>
@@ -17357,6 +17679,7 @@
       <w:pPr>
         <w:rPr>
           <w:color w:val="000000" w:themeColor="text1"/>
+          <w:lang w:val="en-US"/>
         </w:rPr>
       </w:pPr>
       <w:r>
@@ -17380,7 +17703,6 @@
       <w:pPr>
         <w:rPr>
           <w:color w:val="000000" w:themeColor="text1"/>
-          <w:lang w:val="en-US"/>
         </w:rPr>
       </w:pPr>
       <w:r>
@@ -17408,13 +17730,11 @@
       <w:pPr>
         <w:rPr>
           <w:color w:val="000000" w:themeColor="text1"/>
-          <w:lang w:val="en-US"/>
-        </w:rPr>
-      </w:pPr>
-      <w:r>
-        <w:rPr>
-          <w:color w:val="000000" w:themeColor="text1"/>
-          <w:lang w:val="en-US"/>
+        </w:rPr>
+      </w:pPr>
+      <w:r>
+        <w:rPr>
+          <w:color w:val="000000" w:themeColor="text1"/>
         </w:rPr>
         <w:t xml:space="preserve">  - </w:t>
       </w:r>
@@ -17422,14 +17742,66 @@
         <w:rPr>
           <w:color w:val="000000" w:themeColor="text1"/>
         </w:rPr>
+        <w:t xml:space="preserve">Και τα 2 </w:t>
+      </w:r>
+      <w:r>
+        <w:rPr>
+          <w:color w:val="000000" w:themeColor="text1"/>
+          <w:lang w:val="en-US"/>
+        </w:rPr>
+        <w:t>terminals</w:t>
+      </w:r>
+      <w:r>
+        <w:rPr>
+          <w:color w:val="000000" w:themeColor="text1"/>
+        </w:rPr>
+        <w:t xml:space="preserve"> </w:t>
+      </w:r>
+      <w:r>
+        <w:rPr>
+          <w:color w:val="000000" w:themeColor="text1"/>
+        </w:rPr>
+        <w:t>πρέπει να τρέχουν ταυτόχρονα</w:t>
+      </w:r>
+    </w:p>
+    <w:p>
+      <w:pPr>
+        <w:rPr>
+          <w:color w:val="000000" w:themeColor="text1"/>
+        </w:rPr>
+      </w:pPr>
+      <w:r>
+        <w:rPr>
+          <w:color w:val="000000" w:themeColor="text1"/>
+        </w:rPr>
+        <w:t xml:space="preserve">  - </w:t>
+      </w:r>
+      <w:r>
+        <w:rPr>
+          <w:color w:val="000000" w:themeColor="text1"/>
+        </w:rPr>
         <w:t>Το</w:t>
       </w:r>
       <w:r>
         <w:rPr>
           <w:color w:val="000000" w:themeColor="text1"/>
-          <w:lang w:val="en-US"/>
-        </w:rPr>
-        <w:t xml:space="preserve"> MobileNetV2 </w:t>
+        </w:rPr>
+        <w:t xml:space="preserve"> </w:t>
+      </w:r>
+      <w:proofErr w:type="spellStart"/>
+      <w:r>
+        <w:rPr>
+          <w:color w:val="000000" w:themeColor="text1"/>
+          <w:lang w:val="en-US"/>
+        </w:rPr>
+        <w:t>MobileNetV</w:t>
+      </w:r>
+      <w:proofErr w:type="spellEnd"/>
+      <w:r>
+        <w:rPr>
+          <w:color w:val="000000" w:themeColor="text1"/>
+        </w:rPr>
+        <w:t xml:space="preserve">2 </w:t>
       </w:r>
       <w:r>
         <w:rPr>
@@ -17440,9 +17812,21 @@
       <w:r>
         <w:rPr>
           <w:color w:val="000000" w:themeColor="text1"/>
-          <w:lang w:val="en-US"/>
-        </w:rPr>
-        <w:t xml:space="preserve"> automatically </w:t>
+        </w:rPr>
+        <w:t xml:space="preserve"> </w:t>
+      </w:r>
+      <w:r>
+        <w:rPr>
+          <w:color w:val="000000" w:themeColor="text1"/>
+          <w:lang w:val="en-US"/>
+        </w:rPr>
+        <w:t>automatically</w:t>
+      </w:r>
+      <w:r>
+        <w:rPr>
+          <w:color w:val="000000" w:themeColor="text1"/>
+        </w:rPr>
+        <w:t xml:space="preserve"> </w:t>
       </w:r>
       <w:r>
         <w:rPr>
@@ -17453,7 +17837,6 @@
       <w:r>
         <w:rPr>
           <w:color w:val="000000" w:themeColor="text1"/>
-          <w:lang w:val="en-US"/>
         </w:rPr>
         <w:t xml:space="preserve"> </w:t>
       </w:r>
@@ -17466,7 +17849,6 @@
       <w:r>
         <w:rPr>
           <w:color w:val="000000" w:themeColor="text1"/>
-          <w:lang w:val="en-US"/>
         </w:rPr>
         <w:t xml:space="preserve"> </w:t>
       </w:r>
@@ -17479,21 +17861,32 @@
       <w:r>
         <w:rPr>
           <w:color w:val="000000" w:themeColor="text1"/>
-          <w:lang w:val="en-US"/>
-        </w:rPr>
-        <w:t xml:space="preserve"> (~14MB)</w:t>
-      </w:r>
-    </w:p>
-    <w:p>
-      <w:pPr>
-        <w:rPr>
-          <w:color w:val="000000" w:themeColor="text1"/>
-        </w:rPr>
-      </w:pPr>
-      <w:r>
-        <w:rPr>
-          <w:color w:val="000000" w:themeColor="text1"/>
-          <w:lang w:val="en-US"/>
+        </w:rPr>
+        <w:t xml:space="preserve"> (~14</w:t>
+      </w:r>
+      <w:r>
+        <w:rPr>
+          <w:color w:val="000000" w:themeColor="text1"/>
+          <w:lang w:val="en-US"/>
+        </w:rPr>
+        <w:t>MB</w:t>
+      </w:r>
+      <w:r>
+        <w:rPr>
+          <w:color w:val="000000" w:themeColor="text1"/>
+        </w:rPr>
+        <w:t>)</w:t>
+      </w:r>
+    </w:p>
+    <w:p>
+      <w:pPr>
+        <w:rPr>
+          <w:color w:val="000000" w:themeColor="text1"/>
+        </w:rPr>
+      </w:pPr>
+      <w:r>
+        <w:rPr>
+          <w:color w:val="000000" w:themeColor="text1"/>
         </w:rPr>
         <w:t xml:space="preserve">  </w:t>
       </w:r>
@@ -17589,6 +17982,82 @@
       <w:r>
         <w:rPr>
           <w:color w:val="000000" w:themeColor="text1"/>
+        </w:rPr>
+        <w:t xml:space="preserve">  </w:t>
+      </w:r>
+      <w:r>
+        <w:rPr>
+          <w:color w:val="000000" w:themeColor="text1"/>
+          <w:lang w:val="en-US"/>
+        </w:rPr>
+        <w:t xml:space="preserve">- </w:t>
+      </w:r>
+      <w:r>
+        <w:rPr>
+          <w:color w:val="000000" w:themeColor="text1"/>
+        </w:rPr>
+        <w:t>Τα</w:t>
+      </w:r>
+      <w:r>
+        <w:rPr>
+          <w:color w:val="000000" w:themeColor="text1"/>
+          <w:lang w:val="en-US"/>
+        </w:rPr>
+        <w:t xml:space="preserve"> rotation keys </w:t>
+      </w:r>
+      <w:r>
+        <w:rPr>
+          <w:color w:val="000000" w:themeColor="text1"/>
+        </w:rPr>
+        <w:t>στα</w:t>
+      </w:r>
+      <w:r>
+        <w:rPr>
+          <w:color w:val="000000" w:themeColor="text1"/>
+          <w:lang w:val="en-US"/>
+        </w:rPr>
+        <w:t xml:space="preserve"> Python </w:t>
+      </w:r>
+      <w:proofErr w:type="spellStart"/>
+      <w:r>
+        <w:rPr>
+          <w:color w:val="000000" w:themeColor="text1"/>
+          <w:lang w:val="en-US"/>
+        </w:rPr>
+        <w:t>dicts</w:t>
+      </w:r>
+      <w:proofErr w:type="spellEnd"/>
+      <w:r>
+        <w:rPr>
+          <w:color w:val="000000" w:themeColor="text1"/>
+          <w:lang w:val="en-US"/>
+        </w:rPr>
+        <w:t xml:space="preserve"> </w:t>
+      </w:r>
+      <w:r>
+        <w:rPr>
+          <w:color w:val="000000" w:themeColor="text1"/>
+        </w:rPr>
+        <w:t>είναι</w:t>
+      </w:r>
+      <w:r>
+        <w:rPr>
+          <w:color w:val="000000" w:themeColor="text1"/>
+          <w:lang w:val="en-US"/>
+        </w:rPr>
+        <w:t xml:space="preserve"> strings ("0", "90", "180", "270")</w:t>
+      </w:r>
+    </w:p>
+    <w:p>
+      <w:pPr>
+        <w:rPr>
+          <w:color w:val="000000" w:themeColor="text1"/>
+          <w:lang w:val="en-US"/>
+        </w:rPr>
+      </w:pPr>
+      <w:r>
+        <w:rPr>
+          <w:color w:val="000000" w:themeColor="text1"/>
           <w:lang w:val="en-US"/>
         </w:rPr>
         <w:t xml:space="preserve">  - </w:t>
@@ -17604,7 +18073,7 @@
           <w:color w:val="000000" w:themeColor="text1"/>
           <w:lang w:val="en-US"/>
         </w:rPr>
-        <w:t xml:space="preserve"> rotation keys </w:t>
+        <w:t xml:space="preserve"> rotation values </w:t>
       </w:r>
       <w:r>
         <w:rPr>
@@ -17617,23 +18086,7 @@
           <w:color w:val="000000" w:themeColor="text1"/>
           <w:lang w:val="en-US"/>
         </w:rPr>
-        <w:t xml:space="preserve"> Python </w:t>
-      </w:r>
-      <w:proofErr w:type="spellStart"/>
-      <w:r>
-        <w:rPr>
-          <w:color w:val="000000" w:themeColor="text1"/>
-          <w:lang w:val="en-US"/>
-        </w:rPr>
-        <w:t>dicts</w:t>
-      </w:r>
-      <w:proofErr w:type="spellEnd"/>
-      <w:r>
-        <w:rPr>
-          <w:color w:val="000000" w:themeColor="text1"/>
-          <w:lang w:val="en-US"/>
-        </w:rPr>
-        <w:t xml:space="preserve"> </w:t>
+        <w:t xml:space="preserve"> responses </w:t>
       </w:r>
       <w:r>
         <w:rPr>
@@ -17646,59 +18099,6 @@
           <w:color w:val="000000" w:themeColor="text1"/>
           <w:lang w:val="en-US"/>
         </w:rPr>
-        <w:t xml:space="preserve"> strings ("0", "90", "180", "270")</w:t>
-      </w:r>
-    </w:p>
-    <w:p>
-      <w:pPr>
-        <w:rPr>
-          <w:color w:val="000000" w:themeColor="text1"/>
-        </w:rPr>
-      </w:pPr>
-      <w:r>
-        <w:rPr>
-          <w:color w:val="000000" w:themeColor="text1"/>
-          <w:lang w:val="en-US"/>
-        </w:rPr>
-        <w:t xml:space="preserve">  - </w:t>
-      </w:r>
-      <w:r>
-        <w:rPr>
-          <w:color w:val="000000" w:themeColor="text1"/>
-        </w:rPr>
-        <w:t>Τα</w:t>
-      </w:r>
-      <w:r>
-        <w:rPr>
-          <w:color w:val="000000" w:themeColor="text1"/>
-          <w:lang w:val="en-US"/>
-        </w:rPr>
-        <w:t xml:space="preserve"> rotation values </w:t>
-      </w:r>
-      <w:r>
-        <w:rPr>
-          <w:color w:val="000000" w:themeColor="text1"/>
-        </w:rPr>
-        <w:t>στα</w:t>
-      </w:r>
-      <w:r>
-        <w:rPr>
-          <w:color w:val="000000" w:themeColor="text1"/>
-          <w:lang w:val="en-US"/>
-        </w:rPr>
-        <w:t xml:space="preserve"> responses </w:t>
-      </w:r>
-      <w:r>
-        <w:rPr>
-          <w:color w:val="000000" w:themeColor="text1"/>
-        </w:rPr>
-        <w:t>είναι</w:t>
-      </w:r>
-      <w:r>
-        <w:rPr>
-          <w:color w:val="000000" w:themeColor="text1"/>
-          <w:lang w:val="en-US"/>
-        </w:rPr>
         <w:t xml:space="preserve"> integers (0, 90, 180, 270)</w:t>
       </w:r>
     </w:p>
@@ -17706,13 +18106,15 @@
       <w:pPr>
         <w:rPr>
           <w:color w:val="000000" w:themeColor="text1"/>
-        </w:rPr>
-      </w:pPr>
-    </w:p>
-    <w:p>
-      <w:pPr>
-        <w:rPr>
-          <w:color w:val="000000" w:themeColor="text1"/>
+          <w:lang w:val="en-US"/>
+        </w:rPr>
+      </w:pPr>
+    </w:p>
+    <w:p>
+      <w:pPr>
+        <w:rPr>
+          <w:color w:val="000000" w:themeColor="text1"/>
+          <w:lang w:val="en-US"/>
         </w:rPr>
       </w:pPr>
     </w:p>
@@ -17737,7 +18139,6 @@
           <w:szCs w:val="40"/>
           <w:u w:val="single"/>
         </w:rPr>
-        <w:lastRenderedPageBreak/>
         <w:t>Παραδείγματα Κώδικα</w:t>
       </w:r>
     </w:p>
@@ -17778,6 +18179,7 @@
         <w:rPr>
           <w:b/>
           <w:bCs/>
+          <w:noProof/>
           <w:color w:val="000000" w:themeColor="text1"/>
           <w:sz w:val="40"/>
           <w:szCs w:val="40"/>
@@ -17823,6 +18225,7 @@
         <w:rPr>
           <w:b/>
           <w:bCs/>
+          <w:noProof/>
           <w:color w:val="000000" w:themeColor="text1"/>
           <w:sz w:val="40"/>
           <w:szCs w:val="40"/>
@@ -17900,6 +18303,7 @@
         <w:rPr>
           <w:b/>
           <w:bCs/>
+          <w:noProof/>
           <w:color w:val="000000" w:themeColor="text1"/>
           <w:sz w:val="20"/>
           <w:szCs w:val="20"/>
@@ -17944,6 +18348,7 @@
         <w:rPr>
           <w:b/>
           <w:bCs/>
+          <w:noProof/>
           <w:color w:val="000000" w:themeColor="text1"/>
           <w:sz w:val="20"/>
           <w:szCs w:val="20"/>
@@ -18016,6 +18421,7 @@
         <w:rPr>
           <w:b/>
           <w:bCs/>
+          <w:noProof/>
           <w:color w:val="000000" w:themeColor="text1"/>
           <w:sz w:val="20"/>
           <w:szCs w:val="20"/>
@@ -18066,6 +18472,7 @@
         <w:rPr>
           <w:b/>
           <w:bCs/>
+          <w:noProof/>
           <w:color w:val="000000" w:themeColor="text1"/>
           <w:sz w:val="20"/>
           <w:szCs w:val="20"/>
@@ -18148,6 +18555,7 @@
         <w:rPr>
           <w:b/>
           <w:bCs/>
+          <w:noProof/>
           <w:color w:val="000000" w:themeColor="text1"/>
           <w:sz w:val="20"/>
           <w:szCs w:val="20"/>
@@ -18192,6 +18600,7 @@
         <w:rPr>
           <w:b/>
           <w:bCs/>
+          <w:noProof/>
           <w:color w:val="000000" w:themeColor="text1"/>
           <w:sz w:val="20"/>
           <w:szCs w:val="20"/>
@@ -18274,7 +18683,6 @@
           <w:sz w:val="20"/>
           <w:szCs w:val="20"/>
         </w:rPr>
-        <w:lastRenderedPageBreak/>
         <w:t>Τεστ 5:</w:t>
       </w:r>
       <w:r>
@@ -18348,6 +18756,7 @@
         <w:rPr>
           <w:b/>
           <w:bCs/>
+          <w:noProof/>
           <w:color w:val="000000" w:themeColor="text1"/>
           <w:sz w:val="20"/>
           <w:szCs w:val="20"/>
@@ -20352,6 +20761,17 @@
       </w:tblBorders>
     </w:tblPr>
   </w:style>
+  <w:style w:type="character" w:styleId="ae">
+    <w:name w:val="Emphasis"/>
+    <w:basedOn w:val="a0"/>
+    <w:uiPriority w:val="20"/>
+    <w:qFormat/>
+    <w:rsid w:val="00DF5142"/>
+    <w:rPr>
+      <w:i/>
+      <w:iCs/>
+    </w:rPr>
+  </w:style>
 </w:styles>
 </file>
 

</xml_diff>